<commit_message>
Update Arabic translation notes content for 2026-08-03 release
</commit_message>
<xml_diff>
--- a/arb/docx/22.content.docx
+++ b/arb/docx/22.content.docx
@@ -2008,22 +2008,6 @@
       </w:r>
       <w:r>
         <w:rPr>
-          <w:lang w:val="ar_AE" w:bidi="ar_AE"/>
-        </w:rPr>
-        <w:t>טוֹבִ֥ים דֹּדֶ֖י⁠ךָ מִ⁠יָּֽיִן</w:t>
-      </w:r>
-    </w:p>
-    <w:p>
-      <w:pPr>
-        <w:bidi/>
-      </w:pPr>
-      <w:r>
-        <w:rPr>
-          <w:lang w:val="ar_AE" w:bidi="ar_AE"/>
-        </w:rPr>
-      </w:r>
-      <w:r>
-        <w:rPr>
           <w:b/>
           <w:lang w:val="ar_AE" w:bidi="ar_AE"/>
         </w:rPr>
@@ -2861,22 +2845,6 @@
         <w:rPr>
           <w:lang w:val="ar_AE" w:bidi="ar_AE"/>
         </w:rPr>
-      </w:r>
-    </w:p>
-    <w:p>
-      <w:pPr>
-        <w:bidi/>
-      </w:pPr>
-      <w:r>
-        <w:rPr>
-          <w:lang w:val="ar_AE" w:bidi="ar_AE"/>
-        </w:rPr>
-      </w:r>
-      <w:r>
-        <w:rPr>
-          <w:lang w:val="ar_AE" w:bidi="ar_AE"/>
-        </w:rPr>
-        <w:t>מָשְׁכֵ֖⁠נִי</w:t>
       </w:r>
     </w:p>
     <w:p>
@@ -4072,22 +4040,6 @@
       </w:r>
       <w:r>
         <w:rPr>
-          <w:lang w:val="ar_AE" w:bidi="ar_AE"/>
-        </w:rPr>
-        <w:t>נַזְכִּ֤ירָה</w:t>
-      </w:r>
-    </w:p>
-    <w:p>
-      <w:pPr>
-        <w:bidi/>
-      </w:pPr>
-      <w:r>
-        <w:rPr>
-          <w:lang w:val="ar_AE" w:bidi="ar_AE"/>
-        </w:rPr>
-      </w:r>
-      <w:r>
-        <w:rPr>
           <w:b/>
           <w:lang w:val="ar_AE" w:bidi="ar_AE"/>
         </w:rPr>
@@ -4671,22 +4623,6 @@
       </w:r>
       <w:r>
         <w:rPr>
-          <w:lang w:val="ar_AE" w:bidi="ar_AE"/>
-        </w:rPr>
-        <w:t>מֵישָׁרִ֖ים אֲהֵבֽוּ⁠ךָ</w:t>
-      </w:r>
-    </w:p>
-    <w:p>
-      <w:pPr>
-        <w:bidi/>
-      </w:pPr>
-      <w:r>
-        <w:rPr>
-          <w:lang w:val="ar_AE" w:bidi="ar_AE"/>
-        </w:rPr>
-      </w:r>
-      <w:r>
-        <w:rPr>
           <w:b/>
           <w:lang w:val="ar_AE" w:bidi="ar_AE"/>
         </w:rPr>
@@ -4967,22 +4903,6 @@
         <w:rPr>
           <w:lang w:val="ar_AE" w:bidi="ar_AE"/>
         </w:rPr>
-      </w:r>
-    </w:p>
-    <w:p>
-      <w:pPr>
-        <w:bidi/>
-      </w:pPr>
-      <w:r>
-        <w:rPr>
-          <w:lang w:val="ar_AE" w:bidi="ar_AE"/>
-        </w:rPr>
-      </w:r>
-      <w:r>
-        <w:rPr>
-          <w:lang w:val="ar_AE" w:bidi="ar_AE"/>
-        </w:rPr>
-        <w:t>בְּנ֖וֹת יְרוּשָׁלִָ֑ם</w:t>
       </w:r>
     </w:p>
     <w:p>
@@ -5888,22 +5808,6 @@
       </w:r>
       <w:r>
         <w:rPr>
-          <w:lang w:val="ar_AE" w:bidi="ar_AE"/>
-        </w:rPr>
-        <w:t>נֹטֵרָ֣ה אֶת־הַ⁠כְּרָמִ֔ים כַּרְמִ֥⁠י שֶׁ⁠לִּ֖⁠י לֹ֥א נָטָֽרְתִּי</w:t>
-      </w:r>
-    </w:p>
-    <w:p>
-      <w:pPr>
-        <w:bidi/>
-      </w:pPr>
-      <w:r>
-        <w:rPr>
-          <w:lang w:val="ar_AE" w:bidi="ar_AE"/>
-        </w:rPr>
-      </w:r>
-      <w:r>
-        <w:rPr>
           <w:b/>
           <w:lang w:val="ar_AE" w:bidi="ar_AE"/>
         </w:rPr>
@@ -6773,22 +6677,6 @@
       </w:r>
       <w:r>
         <w:rPr>
-          <w:lang w:val="ar_AE" w:bidi="ar_AE"/>
-        </w:rPr>
-        <w:t>אִם־לֹ֤א תֵדְעִי֙ לָ֔⁠ךְ הַ⁠יָּפָ֖ה בַּ⁠נָּשִׁ֑ים צְֽאִי־לָ֞⁠ךְ</w:t>
-      </w:r>
-    </w:p>
-    <w:p>
-      <w:pPr>
-        <w:bidi/>
-      </w:pPr>
-      <w:r>
-        <w:rPr>
-          <w:lang w:val="ar_AE" w:bidi="ar_AE"/>
-        </w:rPr>
-      </w:r>
-      <w:r>
-        <w:rPr>
           <w:b/>
           <w:lang w:val="ar_AE" w:bidi="ar_AE"/>
         </w:rPr>
@@ -6881,22 +6769,6 @@
       </w:r>
       <w:r>
         <w:rPr>
-          <w:lang w:val="ar_AE" w:bidi="ar_AE"/>
-        </w:rPr>
-        <w:t>אִם־לֹ֤א תֵדְעִי֙ לָ֔⁠ךְ הַ⁠יָּפָ֖ה בַּ⁠נָּשִׁ֑ים</w:t>
-      </w:r>
-    </w:p>
-    <w:p>
-      <w:pPr>
-        <w:bidi/>
-      </w:pPr>
-      <w:r>
-        <w:rPr>
-          <w:lang w:val="ar_AE" w:bidi="ar_AE"/>
-        </w:rPr>
-      </w:r>
-      <w:r>
-        <w:rPr>
           <w:b/>
           <w:lang w:val="ar_AE" w:bidi="ar_AE"/>
         </w:rPr>
@@ -7193,22 +7065,6 @@
       </w:r>
       <w:r>
         <w:rPr>
-          <w:lang w:val="ar_AE" w:bidi="ar_AE"/>
-        </w:rPr>
-        <w:t>וּ⁠רְעִי֙ אֶת־גְּדִיֹּתַ֔יִ⁠ךְ</w:t>
-      </w:r>
-    </w:p>
-    <w:p>
-      <w:pPr>
-        <w:bidi/>
-      </w:pPr>
-      <w:r>
-        <w:rPr>
-          <w:lang w:val="ar_AE" w:bidi="ar_AE"/>
-        </w:rPr>
-      </w:r>
-      <w:r>
-        <w:rPr>
           <w:b/>
           <w:lang w:val="ar_AE" w:bidi="ar_AE"/>
         </w:rPr>
@@ -7349,22 +7205,6 @@
       </w:r>
       <w:r>
         <w:rPr>
-          <w:lang w:val="ar_AE" w:bidi="ar_AE"/>
-        </w:rPr>
-        <w:t>לְ⁠סֻסָתִ⁠י֙ בְּ⁠רִכְבֵ֣י פַרְעֹ֔ה דִּמִּיתִ֖י⁠ךְ רַעְיָתִֽ⁠י</w:t>
-      </w:r>
-    </w:p>
-    <w:p>
-      <w:pPr>
-        <w:bidi/>
-      </w:pPr>
-      <w:r>
-        <w:rPr>
-          <w:lang w:val="ar_AE" w:bidi="ar_AE"/>
-        </w:rPr>
-      </w:r>
-      <w:r>
-        <w:rPr>
           <w:b/>
           <w:lang w:val="ar_AE" w:bidi="ar_AE"/>
         </w:rPr>
@@ -8021,22 +7861,6 @@
       </w:r>
       <w:r>
         <w:rPr>
-          <w:lang w:val="ar_AE" w:bidi="ar_AE"/>
-        </w:rPr>
-        <w:t>תּוֹרֵ֤י</w:t>
-      </w:r>
-    </w:p>
-    <w:p>
-      <w:pPr>
-        <w:bidi/>
-      </w:pPr>
-      <w:r>
-        <w:rPr>
-          <w:lang w:val="ar_AE" w:bidi="ar_AE"/>
-        </w:rPr>
-      </w:r>
-      <w:r>
-        <w:rPr>
           <w:b/>
           <w:lang w:val="ar_AE" w:bidi="ar_AE"/>
         </w:rPr>
@@ -8263,22 +8087,6 @@
         <w:rPr>
           <w:lang w:val="ar_AE" w:bidi="ar_AE"/>
         </w:rPr>
-      </w:r>
-    </w:p>
-    <w:p>
-      <w:pPr>
-        <w:bidi/>
-      </w:pPr>
-      <w:r>
-        <w:rPr>
-          <w:lang w:val="ar_AE" w:bidi="ar_AE"/>
-        </w:rPr>
-      </w:r>
-      <w:r>
-        <w:rPr>
-          <w:lang w:val="ar_AE" w:bidi="ar_AE"/>
-        </w:rPr>
-        <w:t>עִ֖ם נְקֻדּ֥וֹת הַ⁠כָּֽסֶף</w:t>
       </w:r>
     </w:p>
     <w:p>
@@ -8760,22 +8568,6 @@
       </w:r>
       <w:r>
         <w:rPr>
-          <w:lang w:val="ar_AE" w:bidi="ar_AE"/>
-        </w:rPr>
-        <w:t>נָתַ֥ן רֵיחֽ⁠וֹ</w:t>
-      </w:r>
-    </w:p>
-    <w:p>
-      <w:pPr>
-        <w:bidi/>
-      </w:pPr>
-      <w:r>
-        <w:rPr>
-          <w:lang w:val="ar_AE" w:bidi="ar_AE"/>
-        </w:rPr>
-      </w:r>
-      <w:r>
-        <w:rPr>
           <w:b/>
           <w:lang w:val="ar_AE" w:bidi="ar_AE"/>
         </w:rPr>
@@ -9050,22 +8842,6 @@
       </w:r>
       <w:r>
         <w:rPr>
-          <w:lang w:val="ar_AE" w:bidi="ar_AE"/>
-        </w:rPr>
-        <w:t>דּוֹדִ⁠י֙</w:t>
-      </w:r>
-    </w:p>
-    <w:p>
-      <w:pPr>
-        <w:bidi/>
-      </w:pPr>
-      <w:r>
-        <w:rPr>
-          <w:lang w:val="ar_AE" w:bidi="ar_AE"/>
-        </w:rPr>
-      </w:r>
-      <w:r>
-        <w:rPr>
           <w:b/>
           <w:lang w:val="ar_AE" w:bidi="ar_AE"/>
         </w:rPr>
@@ -9123,22 +8899,6 @@
         <w:rPr>
           <w:lang w:val="ar_AE" w:bidi="ar_AE"/>
         </w:rPr>
-      </w:r>
-    </w:p>
-    <w:p>
-      <w:pPr>
-        <w:bidi/>
-      </w:pPr>
-      <w:r>
-        <w:rPr>
-          <w:lang w:val="ar_AE" w:bidi="ar_AE"/>
-        </w:rPr>
-      </w:r>
-      <w:r>
-        <w:rPr>
-          <w:lang w:val="ar_AE" w:bidi="ar_AE"/>
-        </w:rPr>
-        <w:t>צְר֨וֹר הַ⁠מֹּ֤ר ׀ דּוֹדִ⁠י֙ לִ֔⁠י בֵּ֥ין שָׁדַ֖⁠י יָלִֽין</w:t>
       </w:r>
     </w:p>
     <w:p>
@@ -12179,22 +11939,6 @@
       </w:r>
       <w:r>
         <w:rPr>
-          <w:lang w:val="ar_AE" w:bidi="ar_AE"/>
-        </w:rPr>
-        <w:t>כְּ⁠שֽׁוֹשַׁנָּה֙ בֵּ֣ין הַ⁠חוֹחִ֔ים כֵּ֥ן רַעְיָתִ֖⁠י בֵּ֥ין הַ⁠בָּנֽוֹת</w:t>
-      </w:r>
-    </w:p>
-    <w:p>
-      <w:pPr>
-        <w:bidi/>
-      </w:pPr>
-      <w:r>
-        <w:rPr>
-          <w:lang w:val="ar_AE" w:bidi="ar_AE"/>
-        </w:rPr>
-      </w:r>
-      <w:r>
-        <w:rPr>
           <w:b/>
           <w:lang w:val="ar_AE" w:bidi="ar_AE"/>
         </w:rPr>
@@ -12827,22 +12571,6 @@
       </w:r>
       <w:r>
         <w:rPr>
-          <w:lang w:val="ar_AE" w:bidi="ar_AE"/>
-        </w:rPr>
-        <w:t>כְּ⁠תַפּ֨וּחַ֙ בַּ⁠עֲצֵ֣י הַ⁠יַּ֔עַר כֵּ֥ן דּוֹדִ֖⁠י בֵּ֣ין הַ⁠בָּנִ֑ים</w:t>
-      </w:r>
-    </w:p>
-    <w:p>
-      <w:pPr>
-        <w:bidi/>
-      </w:pPr>
-      <w:r>
-        <w:rPr>
-          <w:lang w:val="ar_AE" w:bidi="ar_AE"/>
-        </w:rPr>
-      </w:r>
-      <w:r>
-        <w:rPr>
           <w:b/>
           <w:lang w:val="ar_AE" w:bidi="ar_AE"/>
         </w:rPr>
@@ -13579,22 +13307,6 @@
       </w:r>
       <w:r>
         <w:rPr>
-          <w:lang w:val="ar_AE" w:bidi="ar_AE"/>
-        </w:rPr>
-        <w:t>בְּ⁠צִלּ⁠וֹ֙ חִמַּ֣דְתִּי וְ⁠יָשַׁ֔בְתִּי</w:t>
-      </w:r>
-    </w:p>
-    <w:p>
-      <w:pPr>
-        <w:bidi/>
-      </w:pPr>
-      <w:r>
-        <w:rPr>
-          <w:lang w:val="ar_AE" w:bidi="ar_AE"/>
-        </w:rPr>
-      </w:r>
-      <w:r>
-        <w:rPr>
           <w:b/>
           <w:lang w:val="ar_AE" w:bidi="ar_AE"/>
         </w:rPr>
@@ -14887,22 +14599,6 @@
       </w:r>
       <w:r>
         <w:rPr>
-          <w:lang w:val="ar_AE" w:bidi="ar_AE"/>
-        </w:rPr>
-        <w:t>סַמְּכ֨וּ⁠נִי֙ בָּֽ⁠אֲשִׁישׁ֔וֹת רַפְּד֖וּ⁠נִי בַּ⁠תַּפּוּחִ֑ים כִּי־חוֹלַ֥ת אַהֲבָ֖ה אָֽנִי</w:t>
-      </w:r>
-    </w:p>
-    <w:p>
-      <w:pPr>
-        <w:bidi/>
-      </w:pPr>
-      <w:r>
-        <w:rPr>
-          <w:lang w:val="ar_AE" w:bidi="ar_AE"/>
-        </w:rPr>
-      </w:r>
-      <w:r>
-        <w:rPr>
           <w:b/>
           <w:lang w:val="ar_AE" w:bidi="ar_AE"/>
         </w:rPr>
@@ -16803,22 +16499,6 @@
       </w:r>
       <w:r>
         <w:rPr>
-          <w:lang w:val="ar_AE" w:bidi="ar_AE"/>
-        </w:rPr>
-        <w:t>הִנֵּה</w:t>
-      </w:r>
-    </w:p>
-    <w:p>
-      <w:pPr>
-        <w:bidi/>
-      </w:pPr>
-      <w:r>
-        <w:rPr>
-          <w:lang w:val="ar_AE" w:bidi="ar_AE"/>
-        </w:rPr>
-      </w:r>
-      <w:r>
-        <w:rPr>
           <w:b/>
           <w:lang w:val="ar_AE" w:bidi="ar_AE"/>
         </w:rPr>
@@ -17352,6 +17032,22 @@
       </w:r>
       <w:r>
         <w:rPr>
+          <w:lang w:val="ar_AE" w:bidi="ar_AE"/>
+        </w:rPr>
+        <w:t>לִ⁠צְבִ֔י</w:t>
+      </w:r>
+    </w:p>
+    <w:p>
+      <w:pPr>
+        <w:bidi/>
+      </w:pPr>
+      <w:r>
+        <w:rPr>
+          <w:lang w:val="ar_AE" w:bidi="ar_AE"/>
+        </w:rPr>
+      </w:r>
+      <w:r>
+        <w:rPr>
           <w:b/>
           <w:lang w:val="ar_AE" w:bidi="ar_AE"/>
         </w:rPr>
@@ -19265,22 +18961,6 @@
       </w:r>
       <w:r>
         <w:rPr>
-          <w:lang w:val="ar_AE" w:bidi="ar_AE"/>
-        </w:rPr>
-        <w:t>בָ⁠אָ֔רֶץ</w:t>
-      </w:r>
-    </w:p>
-    <w:p>
-      <w:pPr>
-        <w:bidi/>
-      </w:pPr>
-      <w:r>
-        <w:rPr>
-          <w:lang w:val="ar_AE" w:bidi="ar_AE"/>
-        </w:rPr>
-      </w:r>
-      <w:r>
-        <w:rPr>
           <w:b/>
           <w:lang w:val="ar_AE" w:bidi="ar_AE"/>
         </w:rPr>
@@ -19593,22 +19273,6 @@
       </w:r>
       <w:r>
         <w:rPr>
-          <w:lang w:val="ar_AE" w:bidi="ar_AE"/>
-        </w:rPr>
-        <w:t>וְ⁠הַ⁠גְּפָנִ֥ים ׀ סְמָדַ֖ר</w:t>
-      </w:r>
-    </w:p>
-    <w:p>
-      <w:pPr>
-        <w:bidi/>
-      </w:pPr>
-      <w:r>
-        <w:rPr>
-          <w:lang w:val="ar_AE" w:bidi="ar_AE"/>
-        </w:rPr>
-      </w:r>
-      <w:r>
-        <w:rPr>
           <w:b/>
           <w:lang w:val="ar_AE" w:bidi="ar_AE"/>
         </w:rPr>
@@ -19787,22 +19451,6 @@
         <w:rPr>
           <w:lang w:val="ar_AE" w:bidi="ar_AE"/>
         </w:rPr>
-      </w:r>
-    </w:p>
-    <w:p>
-      <w:pPr>
-        <w:bidi/>
-      </w:pPr>
-      <w:r>
-        <w:rPr>
-          <w:lang w:val="ar_AE" w:bidi="ar_AE"/>
-        </w:rPr>
-      </w:r>
-      <w:r>
-        <w:rPr>
-          <w:lang w:val="ar_AE" w:bidi="ar_AE"/>
-        </w:rPr>
-        <w:t>ק֥וּמִי לכי רַעְיָתִ֥⁠י יָפָתִ֖⁠י וּ⁠לְכִי־לָֽ⁠ךְ</w:t>
       </w:r>
     </w:p>
     <w:p>
@@ -20346,22 +19994,6 @@
       </w:r>
       <w:r>
         <w:rPr>
-          <w:lang w:val="ar_AE" w:bidi="ar_AE"/>
-        </w:rPr>
-        <w:t>הַרְאִ֨י⁠נִי֙ אֶתּ־מַרְאַ֔יִ⁠ךְ הַשְׁמִיעִ֖י⁠נִי אֶת־קוֹלֵ֑⁠ךְ כִּי־קוֹלֵ֥⁠ךְ עָרֵ֖ב וּ⁠מַרְאֵ֥י⁠ךְ נָאוֶֽה</w:t>
-      </w:r>
-    </w:p>
-    <w:p>
-      <w:pPr>
-        <w:bidi/>
-      </w:pPr>
-      <w:r>
-        <w:rPr>
-          <w:lang w:val="ar_AE" w:bidi="ar_AE"/>
-        </w:rPr>
-      </w:r>
-      <w:r>
-        <w:rPr>
           <w:b/>
           <w:lang w:val="ar_AE" w:bidi="ar_AE"/>
         </w:rPr>
@@ -20588,22 +20220,6 @@
       </w:r>
       <w:r>
         <w:rPr>
-          <w:lang w:val="ar_AE" w:bidi="ar_AE"/>
-        </w:rPr>
-        <w:t>קוֹלֵ֥⁠ךְ עָרֵ֖ב</w:t>
-      </w:r>
-    </w:p>
-    <w:p>
-      <w:pPr>
-        <w:bidi/>
-      </w:pPr>
-      <w:r>
-        <w:rPr>
-          <w:lang w:val="ar_AE" w:bidi="ar_AE"/>
-        </w:rPr>
-      </w:r>
-      <w:r>
-        <w:rPr>
           <w:b/>
           <w:lang w:val="ar_AE" w:bidi="ar_AE"/>
         </w:rPr>
@@ -21042,22 +20658,6 @@
       </w:r>
       <w:r>
         <w:rPr>
-          <w:lang w:val="ar_AE" w:bidi="ar_AE"/>
-        </w:rPr>
-        <w:t>לָ֨⁠נוּ֙ &amp; וּ⁠כְרָמֵ֖י⁠נוּ</w:t>
-      </w:r>
-    </w:p>
-    <w:p>
-      <w:pPr>
-        <w:bidi/>
-      </w:pPr>
-      <w:r>
-        <w:rPr>
-          <w:lang w:val="ar_AE" w:bidi="ar_AE"/>
-        </w:rPr>
-      </w:r>
-      <w:r>
-        <w:rPr>
           <w:b/>
           <w:lang w:val="ar_AE" w:bidi="ar_AE"/>
         </w:rPr>
@@ -21176,22 +20776,6 @@
       </w:r>
       <w:r>
         <w:rPr>
-          <w:lang w:val="ar_AE" w:bidi="ar_AE"/>
-        </w:rPr>
-        <w:t>וּ⁠כְרָמֵ֖י⁠נוּ סְמָדַֽר</w:t>
-      </w:r>
-    </w:p>
-    <w:p>
-      <w:pPr>
-        <w:bidi/>
-      </w:pPr>
-      <w:r>
-        <w:rPr>
-          <w:lang w:val="ar_AE" w:bidi="ar_AE"/>
-        </w:rPr>
-      </w:r>
-      <w:r>
-        <w:rPr>
           <w:b/>
           <w:lang w:val="ar_AE" w:bidi="ar_AE"/>
         </w:rPr>
@@ -21453,22 +21037,6 @@
         <w:rPr>
           <w:lang w:val="ar_AE" w:bidi="ar_AE"/>
         </w:rPr>
-      </w:r>
-    </w:p>
-    <w:p>
-      <w:pPr>
-        <w:bidi/>
-      </w:pPr>
-      <w:r>
-        <w:rPr>
-          <w:lang w:val="ar_AE" w:bidi="ar_AE"/>
-        </w:rPr>
-      </w:r>
-      <w:r>
-        <w:rPr>
-          <w:lang w:val="ar_AE" w:bidi="ar_AE"/>
-        </w:rPr>
-        <w:t>הָ⁠רֹעֶ֖ה בַּ⁠שּׁוֹשַׁנִּֽים</w:t>
       </w:r>
     </w:p>
     <w:p>
@@ -22063,22 +21631,6 @@
       </w:r>
       <w:r>
         <w:rPr>
-          <w:lang w:val="ar_AE" w:bidi="ar_AE"/>
-        </w:rPr>
-        <w:t>סֹב֩ דְּמֵה־לְ⁠ךָ֨ דוֹדִ֜⁠י</w:t>
-      </w:r>
-    </w:p>
-    <w:p>
-      <w:pPr>
-        <w:bidi/>
-      </w:pPr>
-      <w:r>
-        <w:rPr>
-          <w:lang w:val="ar_AE" w:bidi="ar_AE"/>
-        </w:rPr>
-      </w:r>
-      <w:r>
-        <w:rPr>
           <w:b/>
           <w:lang w:val="ar_AE" w:bidi="ar_AE"/>
         </w:rPr>
@@ -22972,22 +22524,6 @@
       </w:r>
       <w:r>
         <w:rPr>
-          <w:lang w:val="ar_AE" w:bidi="ar_AE"/>
-        </w:rPr>
-        <w:t>אֵ֥ת שֶׁ⁠אָהֲבָ֖ה נַפְשִׁ֑⁠י</w:t>
-      </w:r>
-    </w:p>
-    <w:p>
-      <w:pPr>
-        <w:bidi/>
-      </w:pPr>
-      <w:r>
-        <w:rPr>
-          <w:lang w:val="ar_AE" w:bidi="ar_AE"/>
-        </w:rPr>
-      </w:r>
-      <w:r>
-        <w:rPr>
           <w:b/>
           <w:lang w:val="ar_AE" w:bidi="ar_AE"/>
         </w:rPr>
@@ -23190,22 +22726,6 @@
       </w:r>
       <w:r>
         <w:rPr>
-          <w:lang w:val="ar_AE" w:bidi="ar_AE"/>
-        </w:rPr>
-        <w:t>וַ⁠אֲסוֹבְבָ֣ה בָ⁠עִ֗יר</w:t>
-      </w:r>
-    </w:p>
-    <w:p>
-      <w:pPr>
-        <w:bidi/>
-      </w:pPr>
-      <w:r>
-        <w:rPr>
-          <w:lang w:val="ar_AE" w:bidi="ar_AE"/>
-        </w:rPr>
-      </w:r>
-      <w:r>
-        <w:rPr>
           <w:b/>
           <w:lang w:val="ar_AE" w:bidi="ar_AE"/>
         </w:rPr>
@@ -23397,22 +22917,6 @@
       </w:r>
       <w:r>
         <w:rPr>
-          <w:lang w:val="ar_AE" w:bidi="ar_AE"/>
-        </w:rPr>
-        <w:t>אֲבַקְשָׁ֕ה &amp; בִּקַּשְׁתִּ֖י⁠ו</w:t>
-      </w:r>
-    </w:p>
-    <w:p>
-      <w:pPr>
-        <w:bidi/>
-      </w:pPr>
-      <w:r>
-        <w:rPr>
-          <w:lang w:val="ar_AE" w:bidi="ar_AE"/>
-        </w:rPr>
-      </w:r>
-      <w:r>
-        <w:rPr>
           <w:b/>
           <w:lang w:val="ar_AE" w:bidi="ar_AE"/>
         </w:rPr>
@@ -23483,22 +22987,6 @@
         <w:rPr>
           <w:lang w:val="ar_AE" w:bidi="ar_AE"/>
         </w:rPr>
-      </w:r>
-    </w:p>
-    <w:p>
-      <w:pPr>
-        <w:bidi/>
-      </w:pPr>
-      <w:r>
-        <w:rPr>
-          <w:lang w:val="ar_AE" w:bidi="ar_AE"/>
-        </w:rPr>
-      </w:r>
-      <w:r>
-        <w:rPr>
-          <w:lang w:val="ar_AE" w:bidi="ar_AE"/>
-        </w:rPr>
-        <w:t>אֵ֥ת שֶׁ⁠אָהֲבָ֖ה נַפְשִׁ֑⁠י</w:t>
       </w:r>
     </w:p>
     <w:p>
@@ -23848,22 +23336,6 @@
       </w:r>
       <w:r>
         <w:rPr>
-          <w:lang w:val="ar_AE" w:bidi="ar_AE"/>
-        </w:rPr>
-        <w:t>אֵ֛ת שֶׁ⁠אָהֲבָ֥ה נַפְשִׁ֖⁠י</w:t>
-      </w:r>
-    </w:p>
-    <w:p>
-      <w:pPr>
-        <w:bidi/>
-      </w:pPr>
-      <w:r>
-        <w:rPr>
-          <w:lang w:val="ar_AE" w:bidi="ar_AE"/>
-        </w:rPr>
-      </w:r>
-      <w:r>
-        <w:rPr>
           <w:b/>
           <w:lang w:val="ar_AE" w:bidi="ar_AE"/>
         </w:rPr>
@@ -23974,22 +23446,6 @@
       </w:r>
       <w:r>
         <w:rPr>
-          <w:lang w:val="ar_AE" w:bidi="ar_AE"/>
-        </w:rPr>
-        <w:t>אֵ֛ת שֶׁ⁠אָהֲבָ֥ה נַפְשִׁ֖⁠י רְאִיתֶֽם</w:t>
-      </w:r>
-    </w:p>
-    <w:p>
-      <w:pPr>
-        <w:bidi/>
-      </w:pPr>
-      <w:r>
-        <w:rPr>
-          <w:lang w:val="ar_AE" w:bidi="ar_AE"/>
-        </w:rPr>
-      </w:r>
-      <w:r>
-        <w:rPr>
           <w:b/>
           <w:lang w:val="ar_AE" w:bidi="ar_AE"/>
         </w:rPr>
@@ -24060,22 +23516,6 @@
       </w:r>
       <w:r>
         <w:rPr>
-          <w:lang w:val="ar_AE" w:bidi="ar_AE"/>
-        </w:rPr>
-        <w:t>כִּ⁠מְעַט֙</w:t>
-      </w:r>
-    </w:p>
-    <w:p>
-      <w:pPr>
-        <w:bidi/>
-      </w:pPr>
-      <w:r>
-        <w:rPr>
-          <w:lang w:val="ar_AE" w:bidi="ar_AE"/>
-        </w:rPr>
-      </w:r>
-      <w:r>
-        <w:rPr>
           <w:b/>
           <w:lang w:val="ar_AE" w:bidi="ar_AE"/>
         </w:rPr>
@@ -24133,22 +23573,6 @@
         <w:rPr>
           <w:lang w:val="ar_AE" w:bidi="ar_AE"/>
         </w:rPr>
-      </w:r>
-    </w:p>
-    <w:p>
-      <w:pPr>
-        <w:bidi/>
-      </w:pPr>
-      <w:r>
-        <w:rPr>
-          <w:lang w:val="ar_AE" w:bidi="ar_AE"/>
-        </w:rPr>
-      </w:r>
-      <w:r>
-        <w:rPr>
-          <w:lang w:val="ar_AE" w:bidi="ar_AE"/>
-        </w:rPr>
-        <w:t>אֵ֥ת שֶׁ⁠אָהֲבָ֖ה נַפְשִׁ֑⁠י</w:t>
       </w:r>
     </w:p>
     <w:p>
@@ -24611,22 +24035,6 @@
       </w:r>
       <w:r>
         <w:rPr>
-          <w:lang w:val="ar_AE" w:bidi="ar_AE"/>
-        </w:rPr>
-        <w:t>מִ֣י זֹ֗את עֹלָה֙ מִן־הַ⁠מִּדְבָּ֔ר כְּ⁠תִֽימֲר֖וֹת עָשָׁ֑ן מְקֻטֶּ֤רֶת מוֹר֙ וּ⁠לְבוֹנָ֔ה מִ⁠כֹּ֖ל אַבְקַ֥ת רוֹכֵֽל</w:t>
-      </w:r>
-    </w:p>
-    <w:p>
-      <w:pPr>
-        <w:bidi/>
-      </w:pPr>
-      <w:r>
-        <w:rPr>
-          <w:lang w:val="ar_AE" w:bidi="ar_AE"/>
-        </w:rPr>
-      </w:r>
-      <w:r>
-        <w:rPr>
           <w:b/>
           <w:lang w:val="ar_AE" w:bidi="ar_AE"/>
         </w:rPr>
@@ -26159,22 +25567,6 @@
       </w:r>
       <w:r>
         <w:rPr>
-          <w:lang w:val="ar_AE" w:bidi="ar_AE"/>
-        </w:rPr>
-        <w:t>מְלֻמְּדֵ֖י מִלְחָמָ֑ה</w:t>
-      </w:r>
-    </w:p>
-    <w:p>
-      <w:pPr>
-        <w:bidi/>
-      </w:pPr>
-      <w:r>
-        <w:rPr>
-          <w:lang w:val="ar_AE" w:bidi="ar_AE"/>
-        </w:rPr>
-      </w:r>
-      <w:r>
-        <w:rPr>
           <w:b/>
           <w:lang w:val="ar_AE" w:bidi="ar_AE"/>
         </w:rPr>
@@ -26484,22 +25876,6 @@
         <w:rPr>
           <w:lang w:val="ar_AE" w:bidi="ar_AE"/>
         </w:rPr>
-      </w:r>
-    </w:p>
-    <w:p>
-      <w:pPr>
-        <w:bidi/>
-      </w:pPr>
-      <w:r>
-        <w:rPr>
-          <w:lang w:val="ar_AE" w:bidi="ar_AE"/>
-        </w:rPr>
-      </w:r>
-      <w:r>
-        <w:rPr>
-          <w:lang w:val="ar_AE" w:bidi="ar_AE"/>
-        </w:rPr>
-        <w:t>אַפִּרְי֗וֹן</w:t>
       </w:r>
     </w:p>
     <w:p>
@@ -26693,22 +26069,6 @@
       </w:r>
       <w:r>
         <w:rPr>
-          <w:lang w:val="ar_AE" w:bidi="ar_AE"/>
-        </w:rPr>
-        <w:t>אַפִּרְי֗וֹן עָ֤שָׂה ל⁠וֹ֙ הַ⁠מֶּ֣לֶךְ שְׁלֹמֹ֔ה מֵ⁠עֲצֵ֖י הַ⁠לְּבָנֽוֹן</w:t>
-      </w:r>
-    </w:p>
-    <w:p>
-      <w:pPr>
-        <w:bidi/>
-      </w:pPr>
-      <w:r>
-        <w:rPr>
-          <w:lang w:val="ar_AE" w:bidi="ar_AE"/>
-        </w:rPr>
-      </w:r>
-      <w:r>
-        <w:rPr>
           <w:b/>
           <w:lang w:val="ar_AE" w:bidi="ar_AE"/>
         </w:rPr>
@@ -26871,22 +26231,6 @@
       </w:r>
       <w:r>
         <w:rPr>
-          <w:lang w:val="ar_AE" w:bidi="ar_AE"/>
-        </w:rPr>
-        <w:t>אַפִּרְי֗וֹן עָ֤שָׂה ל⁠וֹ֙ &amp; עַמּוּדָי⁠ו֙ עָ֣שָׂה כֶ֔סֶף</w:t>
-      </w:r>
-    </w:p>
-    <w:p>
-      <w:pPr>
-        <w:bidi/>
-      </w:pPr>
-      <w:r>
-        <w:rPr>
-          <w:lang w:val="ar_AE" w:bidi="ar_AE"/>
-        </w:rPr>
-      </w:r>
-      <w:r>
-        <w:rPr>
           <w:b/>
           <w:lang w:val="ar_AE" w:bidi="ar_AE"/>
         </w:rPr>
@@ -27245,22 +26589,6 @@
       </w:r>
       <w:r>
         <w:rPr>
-          <w:lang w:val="ar_AE" w:bidi="ar_AE"/>
-        </w:rPr>
-        <w:t>מֶרְכָּב֖⁠וֹ אַרְגָּמָ֑ן</w:t>
-      </w:r>
-    </w:p>
-    <w:p>
-      <w:pPr>
-        <w:bidi/>
-      </w:pPr>
-      <w:r>
-        <w:rPr>
-          <w:lang w:val="ar_AE" w:bidi="ar_AE"/>
-        </w:rPr>
-      </w:r>
-      <w:r>
-        <w:rPr>
           <w:b/>
           <w:lang w:val="ar_AE" w:bidi="ar_AE"/>
         </w:rPr>
@@ -27331,22 +26659,6 @@
       </w:r>
       <w:r>
         <w:rPr>
-          <w:lang w:val="ar_AE" w:bidi="ar_AE"/>
-        </w:rPr>
-        <w:t>תּוֹכ⁠וֹ֙ רָצ֣וּף אַהֲבָ֔ה מִ⁠בְּנ֖וֹת יְרוּשָׁלִָֽם</w:t>
-      </w:r>
-    </w:p>
-    <w:p>
-      <w:pPr>
-        <w:bidi/>
-      </w:pPr>
-      <w:r>
-        <w:rPr>
-          <w:lang w:val="ar_AE" w:bidi="ar_AE"/>
-        </w:rPr>
-      </w:r>
-      <w:r>
-        <w:rPr>
           <w:b/>
           <w:lang w:val="ar_AE" w:bidi="ar_AE"/>
         </w:rPr>
@@ -27531,22 +26843,6 @@
         <w:rPr>
           <w:lang w:val="ar_AE" w:bidi="ar_AE"/>
         </w:rPr>
-      </w:r>
-    </w:p>
-    <w:p>
-      <w:pPr>
-        <w:bidi/>
-      </w:pPr>
-      <w:r>
-        <w:rPr>
-          <w:lang w:val="ar_AE" w:bidi="ar_AE"/>
-        </w:rPr>
-      </w:r>
-      <w:r>
-        <w:rPr>
-          <w:lang w:val="ar_AE" w:bidi="ar_AE"/>
-        </w:rPr>
-        <w:t>תּוֹכ⁠וֹ֙ רָצ֣וּף אַהֲבָ֔ה מִ⁠בְּנ֖וֹת יְרוּשָׁלִָֽם</w:t>
       </w:r>
     </w:p>
     <w:p>
@@ -29406,22 +28702,6 @@
       </w:r>
       <w:r>
         <w:rPr>
-          <w:lang w:val="ar_AE" w:bidi="ar_AE"/>
-        </w:rPr>
-        <w:t>מַתְאִימ֔וֹת</w:t>
-      </w:r>
-    </w:p>
-    <w:p>
-      <w:pPr>
-        <w:bidi/>
-      </w:pPr>
-      <w:r>
-        <w:rPr>
-          <w:lang w:val="ar_AE" w:bidi="ar_AE"/>
-        </w:rPr>
-      </w:r>
-      <w:r>
-        <w:rPr>
           <w:b/>
           <w:lang w:val="ar_AE" w:bidi="ar_AE"/>
         </w:rPr>
@@ -29593,22 +28873,6 @@
         <w:rPr>
           <w:lang w:val="ar_AE" w:bidi="ar_AE"/>
         </w:rPr>
-      </w:r>
-    </w:p>
-    <w:p>
-      <w:pPr>
-        <w:bidi/>
-      </w:pPr>
-      <w:r>
-        <w:rPr>
-          <w:lang w:val="ar_AE" w:bidi="ar_AE"/>
-        </w:rPr>
-      </w:r>
-      <w:r>
-        <w:rPr>
-          <w:lang w:val="ar_AE" w:bidi="ar_AE"/>
-        </w:rPr>
-        <w:t>וְ⁠שַׁכֻּלָ֖ה אֵ֥ין בָּ⁠הֶֽם</w:t>
       </w:r>
     </w:p>
     <w:p>
@@ -30560,22 +29824,6 @@
       </w:r>
       <w:r>
         <w:rPr>
-          <w:lang w:val="ar_AE" w:bidi="ar_AE"/>
-        </w:rPr>
-        <w:t>בָּנ֖וּי לְ⁠תַלְפִּיּ֑וֹת</w:t>
-      </w:r>
-    </w:p>
-    <w:p>
-      <w:pPr>
-        <w:bidi/>
-      </w:pPr>
-      <w:r>
-        <w:rPr>
-          <w:lang w:val="ar_AE" w:bidi="ar_AE"/>
-        </w:rPr>
-      </w:r>
-      <w:r>
-        <w:rPr>
           <w:b/>
           <w:lang w:val="ar_AE" w:bidi="ar_AE"/>
         </w:rPr>
@@ -31425,22 +30673,6 @@
       </w:r>
       <w:r>
         <w:rPr>
-          <w:lang w:val="ar_AE" w:bidi="ar_AE"/>
-        </w:rPr>
-        <w:t>עַ֤ד שֶׁ⁠יָּפ֨וּחַ֙ הַ⁠יּ֔וֹם וְ⁠נָ֖סוּ הַ⁠צְּלָלִ֑ים</w:t>
-      </w:r>
-    </w:p>
-    <w:p>
-      <w:pPr>
-        <w:bidi/>
-      </w:pPr>
-      <w:r>
-        <w:rPr>
-          <w:lang w:val="ar_AE" w:bidi="ar_AE"/>
-        </w:rPr>
-      </w:r>
-      <w:r>
-        <w:rPr>
           <w:b/>
           <w:lang w:val="ar_AE" w:bidi="ar_AE"/>
         </w:rPr>
@@ -31926,22 +31158,6 @@
       </w:r>
       <w:r>
         <w:rPr>
-          <w:lang w:val="ar_AE" w:bidi="ar_AE"/>
-        </w:rPr>
-        <w:t>כֻּלָּ֤⁠ךְ יָפָה֙</w:t>
-      </w:r>
-    </w:p>
-    <w:p>
-      <w:pPr>
-        <w:bidi/>
-      </w:pPr>
-      <w:r>
-        <w:rPr>
-          <w:lang w:val="ar_AE" w:bidi="ar_AE"/>
-        </w:rPr>
-      </w:r>
-      <w:r>
-        <w:rPr>
           <w:b/>
           <w:lang w:val="ar_AE" w:bidi="ar_AE"/>
         </w:rPr>
@@ -32567,22 +31783,6 @@
         <w:rPr>
           <w:lang w:val="ar_AE" w:bidi="ar_AE"/>
         </w:rPr>
-      </w:r>
-    </w:p>
-    <w:p>
-      <w:pPr>
-        <w:bidi/>
-      </w:pPr>
-      <w:r>
-        <w:rPr>
-          <w:lang w:val="ar_AE" w:bidi="ar_AE"/>
-        </w:rPr>
-      </w:r>
-      <w:r>
-        <w:rPr>
-          <w:lang w:val="ar_AE" w:bidi="ar_AE"/>
-        </w:rPr>
-        <w:t>לִבַּבְתִּ֖⁠נִי אֲחֹתִ֣⁠י כַלָּ֑ה לִבַּבְתִּ֨י⁠נִי֙</w:t>
       </w:r>
     </w:p>
     <w:p>
@@ -33282,22 +32482,6 @@
       </w:r>
       <w:r>
         <w:rPr>
-          <w:lang w:val="ar_AE" w:bidi="ar_AE"/>
-        </w:rPr>
-        <w:t>מַה־יָּפ֥וּ דֹדַ֖יִ⁠ךְ אֲחֹתִ֣⁠י כַלָּ֑ה מַה־טֹּ֤בוּ דֹדַ֨יִ⁠ךְ֙ מִ⁠יַּ֔יִן</w:t>
-      </w:r>
-    </w:p>
-    <w:p>
-      <w:pPr>
-        <w:bidi/>
-      </w:pPr>
-      <w:r>
-        <w:rPr>
-          <w:lang w:val="ar_AE" w:bidi="ar_AE"/>
-        </w:rPr>
-      </w:r>
-      <w:r>
-        <w:rPr>
           <w:b/>
           <w:lang w:val="ar_AE" w:bidi="ar_AE"/>
         </w:rPr>
@@ -34244,22 +33428,6 @@
         <w:rPr>
           <w:lang w:val="ar_AE" w:bidi="ar_AE"/>
         </w:rPr>
-      </w:r>
-    </w:p>
-    <w:p>
-      <w:pPr>
-        <w:bidi/>
-      </w:pPr>
-      <w:r>
-        <w:rPr>
-          <w:lang w:val="ar_AE" w:bidi="ar_AE"/>
-        </w:rPr>
-      </w:r>
-      <w:r>
-        <w:rPr>
-          <w:lang w:val="ar_AE" w:bidi="ar_AE"/>
-        </w:rPr>
-        <w:t>גַּ֥ן ׀ נָע֖וּל אֲחֹתִ֣⁠י כַלָּ֑ה גַּ֥ל נָע֖וּל מַעְיָ֥ן חָתֽוּם</w:t>
       </w:r>
     </w:p>
     <w:p>
@@ -35230,22 +34398,6 @@
       </w:r>
       <w:r>
         <w:rPr>
-          <w:lang w:val="ar_AE" w:bidi="ar_AE"/>
-        </w:rPr>
-        <w:t>שְׁלָחַ֨יִ⁠ךְ֙ פַּרְדֵּ֣ס רִמּוֹנִ֔ים עִ֖ם פְּרִ֣י מְגָדִ֑ים כְּפָרִ֖ים עִם־נְרָדִֽים׃ נֵ֣רְדְּ ׀ וְ⁠כַרְכֹּ֗ם קָנֶה֙ וְ⁠קִנָּמ֔וֹן עִ֖ם כָּל־עֲצֵ֣י לְבוֹנָ֑ה מֹ֚ר וַ⁠אֲהָל֔וֹת עִ֖ם כָּל־רָאשֵׁ֥י בְשָׂמִֽים</w:t>
-      </w:r>
-    </w:p>
-    <w:p>
-      <w:pPr>
-        <w:bidi/>
-      </w:pPr>
-      <w:r>
-        <w:rPr>
-          <w:lang w:val="ar_AE" w:bidi="ar_AE"/>
-        </w:rPr>
-      </w:r>
-      <w:r>
-        <w:rPr>
           <w:b/>
           <w:lang w:val="ar_AE" w:bidi="ar_AE"/>
         </w:rPr>
@@ -35387,22 +34539,6 @@
       </w:r>
       <w:r>
         <w:rPr>
-          <w:lang w:val="ar_AE" w:bidi="ar_AE"/>
-        </w:rPr>
-        <w:t>שְׁלָחַ֨יִ⁠ךְ֙ פַּרְדֵּ֣ס רִמּוֹנִ֔ים עִ֖ם פְּרִ֣י מְגָדִ֑ים כְּפָרִ֖ים עִם־נְרָדִֽים׃ נֵ֣רְדְּ ׀ וְ⁠כַרְכֹּ֗ם קָנֶה֙ וְ⁠קִנָּמ֔וֹן עִ֖ם כָּל־עֲצֵ֣י לְבוֹנָ֑ה מֹ֚ר וַ⁠אֲהָל֔וֹת עִ֖ם כָּל־רָאשֵׁ֥י בְשָׂמִֽים</w:t>
-      </w:r>
-    </w:p>
-    <w:p>
-      <w:pPr>
-        <w:bidi/>
-      </w:pPr>
-      <w:r>
-        <w:rPr>
-          <w:lang w:val="ar_AE" w:bidi="ar_AE"/>
-        </w:rPr>
-      </w:r>
-      <w:r>
-        <w:rPr>
           <w:b/>
           <w:lang w:val="ar_AE" w:bidi="ar_AE"/>
         </w:rPr>
@@ -35861,22 +34997,6 @@
       </w:r>
       <w:r>
         <w:rPr>
-          <w:lang w:val="ar_AE" w:bidi="ar_AE"/>
-        </w:rPr>
-        <w:t>מַעְיַ֣ן גַּנִּ֔ים בְּאֵ֖ר מַ֣יִם חַיִּ֑ים וְ⁠נֹזְלִ֖ים מִן־לְבָנֽוֹן</w:t>
-      </w:r>
-    </w:p>
-    <w:p>
-      <w:pPr>
-        <w:bidi/>
-      </w:pPr>
-      <w:r>
-        <w:rPr>
-          <w:lang w:val="ar_AE" w:bidi="ar_AE"/>
-        </w:rPr>
-      </w:r>
-      <w:r>
-        <w:rPr>
           <w:b/>
           <w:lang w:val="ar_AE" w:bidi="ar_AE"/>
         </w:rPr>
@@ -36464,22 +35584,6 @@
       </w:r>
       <w:r>
         <w:rPr>
-          <w:lang w:val="ar_AE" w:bidi="ar_AE"/>
-        </w:rPr>
-        <w:t>ע֤וּרִי צָפוֹן֙ וּ⁠ב֣וֹאִי תֵימָ֔ן הָפִ֥יחִי גַנִּ֖⁠י יִזְּל֣וּ בְשָׂמָ֑י⁠ו</w:t>
-      </w:r>
-    </w:p>
-    <w:p>
-      <w:pPr>
-        <w:bidi/>
-      </w:pPr>
-      <w:r>
-        <w:rPr>
-          <w:lang w:val="ar_AE" w:bidi="ar_AE"/>
-        </w:rPr>
-      </w:r>
-      <w:r>
-        <w:rPr>
           <w:b/>
           <w:lang w:val="ar_AE" w:bidi="ar_AE"/>
         </w:rPr>
@@ -36585,22 +35689,6 @@
       </w:r>
       <w:r>
         <w:rPr>
-          <w:lang w:val="ar_AE" w:bidi="ar_AE"/>
-        </w:rPr>
-        <w:t>וּ⁠ב֣וֹאִי &amp; יָבֹ֤א דוֹדִ⁠י֙</w:t>
-      </w:r>
-    </w:p>
-    <w:p>
-      <w:pPr>
-        <w:bidi/>
-      </w:pPr>
-      <w:r>
-        <w:rPr>
-          <w:lang w:val="ar_AE" w:bidi="ar_AE"/>
-        </w:rPr>
-      </w:r>
-      <w:r>
-        <w:rPr>
           <w:b/>
           <w:lang w:val="ar_AE" w:bidi="ar_AE"/>
         </w:rPr>
@@ -36706,22 +35794,6 @@
         <w:rPr>
           <w:lang w:val="ar_AE" w:bidi="ar_AE"/>
         </w:rPr>
-      </w:r>
-    </w:p>
-    <w:p>
-      <w:pPr>
-        <w:bidi/>
-      </w:pPr>
-      <w:r>
-        <w:rPr>
-          <w:lang w:val="ar_AE" w:bidi="ar_AE"/>
-        </w:rPr>
-      </w:r>
-      <w:r>
-        <w:rPr>
-          <w:lang w:val="ar_AE" w:bidi="ar_AE"/>
-        </w:rPr>
-        <w:t>ע֤וּרִי צָפוֹן֙ וּ⁠ב֣וֹאִי תֵימָ֔ן הָפִ֥יחִי גַנִּ֖⁠י יִזְּל֣וּ בְשָׂמָ֑י⁠ו יָבֹ֤א דוֹדִ⁠י֙ לְ⁠גַנּ֔⁠וֹ וְ⁠יֹאכַ֖ל פְּרִ֥י מְגָדָֽי⁠ו</w:t>
       </w:r>
     </w:p>
     <w:p>
@@ -37443,22 +36515,6 @@
       </w:r>
       <w:r>
         <w:rPr>
-          <w:lang w:val="ar_AE" w:bidi="ar_AE"/>
-        </w:rPr>
-        <w:t>בָּ֣אתִי לְ⁠גַנִּ⁠י֮ אֲחֹתִ֣⁠י כַלָּה֒ אָרִ֤יתִי מוֹרִ⁠י֙ עִם־בְּשָׂמִ֔⁠י אָכַ֤לְתִּי יַעְרִ⁠י֙ עִם־דִּבְשִׁ֔⁠י שָׁתִ֥יתִי יֵינִ֖⁠י עִם־חֲלָבִ֑⁠י</w:t>
-      </w:r>
-    </w:p>
-    <w:p>
-      <w:pPr>
-        <w:bidi/>
-      </w:pPr>
-      <w:r>
-        <w:rPr>
-          <w:lang w:val="ar_AE" w:bidi="ar_AE"/>
-        </w:rPr>
-      </w:r>
-      <w:r>
-        <w:rPr>
           <w:b/>
           <w:lang w:val="ar_AE" w:bidi="ar_AE"/>
         </w:rPr>
@@ -37634,22 +36690,6 @@
       </w:r>
       <w:r>
         <w:rPr>
-          <w:lang w:val="ar_AE" w:bidi="ar_AE"/>
-        </w:rPr>
-        <w:t>בָּ֣אתִי לְ⁠גַנִּ⁠י֮ אֲחֹתִ֣⁠י כַלָּה֒ אָרִ֤יתִי מוֹרִ⁠י֙ עִם־בְּשָׂמִ֔⁠י אָכַ֤לְתִּי יַעְרִ⁠י֙ עִם־דִּבְשִׁ֔⁠י שָׁתִ֥יתִי יֵינִ֖⁠י עִם־חֲלָבִ֑⁠י</w:t>
-      </w:r>
-    </w:p>
-    <w:p>
-      <w:pPr>
-        <w:bidi/>
-      </w:pPr>
-      <w:r>
-        <w:rPr>
-          <w:lang w:val="ar_AE" w:bidi="ar_AE"/>
-        </w:rPr>
-      </w:r>
-      <w:r>
-        <w:rPr>
           <w:b/>
           <w:lang w:val="ar_AE" w:bidi="ar_AE"/>
         </w:rPr>
@@ -37864,22 +36904,6 @@
         <w:rPr>
           <w:lang w:val="ar_AE" w:bidi="ar_AE"/>
         </w:rPr>
-      </w:r>
-    </w:p>
-    <w:p>
-      <w:pPr>
-        <w:bidi/>
-      </w:pPr>
-      <w:r>
-        <w:rPr>
-          <w:lang w:val="ar_AE" w:bidi="ar_AE"/>
-        </w:rPr>
-      </w:r>
-      <w:r>
-        <w:rPr>
-          <w:lang w:val="ar_AE" w:bidi="ar_AE"/>
-        </w:rPr>
-        <w:t>בָּ֣אתִי לְ⁠גַנִּ⁠י֮ אֲחֹתִ֣⁠י כַלָּה֒</w:t>
       </w:r>
     </w:p>
     <w:p>
@@ -38523,22 +37547,6 @@
       </w:r>
       <w:r>
         <w:rPr>
-          <w:lang w:val="ar_AE" w:bidi="ar_AE"/>
-        </w:rPr>
-        <w:t>ק֣וֹל ׀ דּוֹדִ֣⁠י דוֹפֵ֗ק</w:t>
-      </w:r>
-    </w:p>
-    <w:p>
-      <w:pPr>
-        <w:bidi/>
-      </w:pPr>
-      <w:r>
-        <w:rPr>
-          <w:lang w:val="ar_AE" w:bidi="ar_AE"/>
-        </w:rPr>
-      </w:r>
-      <w:r>
-        <w:rPr>
           <w:b/>
           <w:lang w:val="ar_AE" w:bidi="ar_AE"/>
         </w:rPr>
@@ -39349,22 +38357,6 @@
       </w:r>
       <w:r>
         <w:rPr>
-          <w:lang w:val="ar_AE" w:bidi="ar_AE"/>
-        </w:rPr>
-        <w:t>פָּשַׁ֨טְתִּי֙ אֶת־כֻּתָּנְתִּ֔⁠י אֵיכָ֖כָה אֶלְבָּשֶׁ֑⁠נָּה רָחַ֥צְתִּי אֶת־רַגְלַ֖⁠י אֵיכָ֥כָה אֲטַנְּפֵֽ⁠ם</w:t>
-      </w:r>
-    </w:p>
-    <w:p>
-      <w:pPr>
-        <w:bidi/>
-      </w:pPr>
-      <w:r>
-        <w:rPr>
-          <w:lang w:val="ar_AE" w:bidi="ar_AE"/>
-        </w:rPr>
-      </w:r>
-      <w:r>
-        <w:rPr>
           <w:b/>
           <w:lang w:val="ar_AE" w:bidi="ar_AE"/>
         </w:rPr>
@@ -39458,22 +38450,6 @@
         <w:rPr>
           <w:lang w:val="ar_AE" w:bidi="ar_AE"/>
         </w:rPr>
-      </w:r>
-    </w:p>
-    <w:p>
-      <w:pPr>
-        <w:bidi/>
-      </w:pPr>
-      <w:r>
-        <w:rPr>
-          <w:lang w:val="ar_AE" w:bidi="ar_AE"/>
-        </w:rPr>
-      </w:r>
-      <w:r>
-        <w:rPr>
-          <w:lang w:val="ar_AE" w:bidi="ar_AE"/>
-        </w:rPr>
-        <w:t>אֵיכָ֖כָה אֶלְבָּשֶׁ֑⁠נָּה רָחַ֥צְתִּי אֶת־רַגְלַ֖⁠י אֵיכָ֥כָה אֲטַנְּפֵֽ⁠ם</w:t>
       </w:r>
     </w:p>
     <w:p>
@@ -41146,22 +40122,6 @@
       </w:r>
       <w:r>
         <w:rPr>
-          <w:lang w:val="ar_AE" w:bidi="ar_AE"/>
-        </w:rPr>
-        <w:t>מְצָאֻ֧⁠נִי הַ⁠שֹּׁמְרִ֛ים הַ⁠סֹּבְבִ֥ים בָּ⁠עִ֖יר</w:t>
-      </w:r>
-    </w:p>
-    <w:p>
-      <w:pPr>
-        <w:bidi/>
-      </w:pPr>
-      <w:r>
-        <w:rPr>
-          <w:lang w:val="ar_AE" w:bidi="ar_AE"/>
-        </w:rPr>
-      </w:r>
-      <w:r>
-        <w:rPr>
           <w:b/>
           <w:lang w:val="ar_AE" w:bidi="ar_AE"/>
         </w:rPr>
@@ -41305,22 +40265,6 @@
       </w:r>
       <w:r>
         <w:rPr>
-          <w:lang w:val="ar_AE" w:bidi="ar_AE"/>
-        </w:rPr>
-        <w:t>הִכּ֣וּ⁠נִי פְצָע֑וּ⁠נִי נָשְׂא֤וּ אֶת־רְדִידִ⁠י֙ מֵֽ⁠עָלַ֔⁠י שֹׁמְרֵ֖י הַ⁠חֹמֽוֹת</w:t>
-      </w:r>
-    </w:p>
-    <w:p>
-      <w:pPr>
-        <w:bidi/>
-      </w:pPr>
-      <w:r>
-        <w:rPr>
-          <w:lang w:val="ar_AE" w:bidi="ar_AE"/>
-        </w:rPr>
-      </w:r>
-      <w:r>
-        <w:rPr>
           <w:b/>
           <w:lang w:val="ar_AE" w:bidi="ar_AE"/>
         </w:rPr>
@@ -42157,22 +41101,6 @@
       </w:r>
       <w:r>
         <w:rPr>
-          <w:lang w:val="ar_AE" w:bidi="ar_AE"/>
-        </w:rPr>
-        <w:t>שֶׁ⁠חוֹלַ֥ת אַהֲבָ֖ה אָֽנִי</w:t>
-      </w:r>
-    </w:p>
-    <w:p>
-      <w:pPr>
-        <w:bidi/>
-      </w:pPr>
-      <w:r>
-        <w:rPr>
-          <w:lang w:val="ar_AE" w:bidi="ar_AE"/>
-        </w:rPr>
-      </w:r>
-      <w:r>
-        <w:rPr>
           <w:b/>
           <w:lang w:val="ar_AE" w:bidi="ar_AE"/>
         </w:rPr>
@@ -42265,22 +41193,6 @@
       </w:r>
       <w:r>
         <w:rPr>
-          <w:lang w:val="ar_AE" w:bidi="ar_AE"/>
-        </w:rPr>
-        <w:t>מַה־דּוֹדֵ֣⁠ךְ מִ⁠דּ֔וֹד הַ⁠יָּפָ֖ה בַּ⁠נָּשִׁ֑ים מַה־דּוֹדֵ֣⁠ךְ מִ⁠דּ֔וֹד שֶׁ⁠כָּ֖כָה הִשְׁבַּעְתָּֽ⁠נוּ</w:t>
-      </w:r>
-    </w:p>
-    <w:p>
-      <w:pPr>
-        <w:bidi/>
-      </w:pPr>
-      <w:r>
-        <w:rPr>
-          <w:lang w:val="ar_AE" w:bidi="ar_AE"/>
-        </w:rPr>
-      </w:r>
-      <w:r>
-        <w:rPr>
           <w:b/>
           <w:lang w:val="ar_AE" w:bidi="ar_AE"/>
         </w:rPr>
@@ -42412,22 +41324,6 @@
       </w:r>
       <w:r>
         <w:rPr>
-          <w:lang w:val="ar_AE" w:bidi="ar_AE"/>
-        </w:rPr>
-        <w:t>מַה־דּוֹדֵ֣⁠ךְ מִ⁠דּ֔וֹד</w:t>
-      </w:r>
-    </w:p>
-    <w:p>
-      <w:pPr>
-        <w:bidi/>
-      </w:pPr>
-      <w:r>
-        <w:rPr>
-          <w:lang w:val="ar_AE" w:bidi="ar_AE"/>
-        </w:rPr>
-      </w:r>
-      <w:r>
-        <w:rPr>
           <w:b/>
           <w:lang w:val="ar_AE" w:bidi="ar_AE"/>
         </w:rPr>
@@ -42485,22 +41381,6 @@
         <w:rPr>
           <w:lang w:val="ar_AE" w:bidi="ar_AE"/>
         </w:rPr>
-      </w:r>
-    </w:p>
-    <w:p>
-      <w:pPr>
-        <w:bidi/>
-      </w:pPr>
-      <w:r>
-        <w:rPr>
-          <w:lang w:val="ar_AE" w:bidi="ar_AE"/>
-        </w:rPr>
-      </w:r>
-      <w:r>
-        <w:rPr>
-          <w:lang w:val="ar_AE" w:bidi="ar_AE"/>
-        </w:rPr>
-        <w:t>מַה־דּוֹדֵ֣⁠ךְ מִ⁠דּ֔וֹד הַ⁠יָּפָ֖ה בַּ⁠נָּשִׁ֑ים</w:t>
       </w:r>
     </w:p>
     <w:p>
@@ -42827,22 +41707,6 @@
       </w:r>
       <w:r>
         <w:rPr>
-          <w:lang w:val="ar_AE" w:bidi="ar_AE"/>
-        </w:rPr>
-        <w:t>הִשְׁבַּעְתָּֽ⁠נוּ</w:t>
-      </w:r>
-    </w:p>
-    <w:p>
-      <w:pPr>
-        <w:bidi/>
-      </w:pPr>
-      <w:r>
-        <w:rPr>
-          <w:lang w:val="ar_AE" w:bidi="ar_AE"/>
-        </w:rPr>
-      </w:r>
-      <w:r>
-        <w:rPr>
           <w:b/>
           <w:lang w:val="ar_AE" w:bidi="ar_AE"/>
         </w:rPr>
@@ -43920,22 +42784,6 @@
       </w:r>
       <w:r>
         <w:rPr>
-          <w:lang w:val="ar_AE" w:bidi="ar_AE"/>
-        </w:rPr>
-        <w:t>עֵינָ֕י⁠ו כְּ⁠יוֹנִ֖ים עַל־אֲפִ֣יקֵי מָ֑יִם רֹֽחֲצוֹת֙ בֶּֽ⁠חָלָ֔ב יֹשְׁב֖וֹת עַל־מִלֵּֽאת</w:t>
-      </w:r>
-    </w:p>
-    <w:p>
-      <w:pPr>
-        <w:bidi/>
-      </w:pPr>
-      <w:r>
-        <w:rPr>
-          <w:lang w:val="ar_AE" w:bidi="ar_AE"/>
-        </w:rPr>
-      </w:r>
-      <w:r>
-        <w:rPr>
           <w:b/>
           <w:lang w:val="ar_AE" w:bidi="ar_AE"/>
         </w:rPr>
@@ -45645,22 +44493,6 @@
       </w:r>
       <w:r>
         <w:rPr>
-          <w:lang w:val="ar_AE" w:bidi="ar_AE"/>
-        </w:rPr>
-        <w:t>מֵעָי⁠ו֙</w:t>
-      </w:r>
-    </w:p>
-    <w:p>
-      <w:pPr>
-        <w:bidi/>
-      </w:pPr>
-      <w:r>
-        <w:rPr>
-          <w:lang w:val="ar_AE" w:bidi="ar_AE"/>
-        </w:rPr>
-      </w:r>
-      <w:r>
-        <w:rPr>
           <w:b/>
           <w:lang w:val="ar_AE" w:bidi="ar_AE"/>
         </w:rPr>
@@ -46700,22 +45532,6 @@
         <w:rPr>
           <w:lang w:val="ar_AE" w:bidi="ar_AE"/>
         </w:rPr>
-      </w:r>
-    </w:p>
-    <w:p>
-      <w:pPr>
-        <w:bidi/>
-      </w:pPr>
-      <w:r>
-        <w:rPr>
-          <w:lang w:val="ar_AE" w:bidi="ar_AE"/>
-        </w:rPr>
-      </w:r>
-      <w:r>
-        <w:rPr>
-          <w:lang w:val="ar_AE" w:bidi="ar_AE"/>
-        </w:rPr>
-        <w:t>וְ⁠כֻלּ֖⁠וֹ מַחֲמַדִּ֑ים</w:t>
       </w:r>
     </w:p>
     <w:p>
@@ -47142,22 +45958,6 @@
       </w:r>
       <w:r>
         <w:rPr>
-          <w:lang w:val="ar_AE" w:bidi="ar_AE"/>
-        </w:rPr>
-        <w:t>אָ֚נָה הָלַ֣ךְ דּוֹדֵ֔⁠ךְ הַ⁠יָּפָ֖ה בַּ⁠נָּשִׁ֑ים אָ֚נָה פָּנָ֣ה דוֹדֵ֔⁠ךְ וּ⁠נְבַקְשֶׁ֖⁠נּוּ עִמָּֽ⁠ךְ</w:t>
-      </w:r>
-    </w:p>
-    <w:p>
-      <w:pPr>
-        <w:bidi/>
-      </w:pPr>
-      <w:r>
-        <w:rPr>
-          <w:lang w:val="ar_AE" w:bidi="ar_AE"/>
-        </w:rPr>
-      </w:r>
-      <w:r>
-        <w:rPr>
           <w:b/>
           <w:lang w:val="ar_AE" w:bidi="ar_AE"/>
         </w:rPr>
@@ -47291,22 +46091,6 @@
         <w:rPr>
           <w:lang w:val="ar_AE" w:bidi="ar_AE"/>
         </w:rPr>
-      </w:r>
-    </w:p>
-    <w:p>
-      <w:pPr>
-        <w:bidi/>
-      </w:pPr>
-      <w:r>
-        <w:rPr>
-          <w:lang w:val="ar_AE" w:bidi="ar_AE"/>
-        </w:rPr>
-      </w:r>
-      <w:r>
-        <w:rPr>
-          <w:lang w:val="ar_AE" w:bidi="ar_AE"/>
-        </w:rPr>
-        <w:t>אָ֚נָה הָלַ֣ךְ דּוֹדֵ֔⁠ךְ &amp; אָ֚נָה פָּנָ֣ה דוֹדֵ֔⁠ךְ</w:t>
       </w:r>
     </w:p>
     <w:p>
@@ -47520,7 +46304,7 @@
         <w:rPr>
           <w:lang w:val="ar_AE" w:bidi="ar_AE"/>
         </w:rPr>
-        <w:t>אָ֚נָה פָּנָ֣ה דוֹדֵ֔⁠ךְ</w:t>
+        <w:t>אָ֚נָה הָלַ֣ךְ דּוֹדֵ֔⁠ךְ &amp; אָ֚נָה פָּנָ֣ה דוֹדֵ֔⁠ךְ</w:t>
       </w:r>
     </w:p>
     <w:p>
@@ -47727,22 +46511,6 @@
         <w:rPr>
           <w:lang w:val="ar_AE" w:bidi="ar_AE"/>
         </w:rPr>
-      </w:r>
-    </w:p>
-    <w:p>
-      <w:pPr>
-        <w:bidi/>
-      </w:pPr>
-      <w:r>
-        <w:rPr>
-          <w:lang w:val="ar_AE" w:bidi="ar_AE"/>
-        </w:rPr>
-      </w:r>
-      <w:r>
-        <w:rPr>
-          <w:lang w:val="ar_AE" w:bidi="ar_AE"/>
-        </w:rPr>
-        <w:t>דּוֹדִ⁠י֙ יָרַ֣ד לְ⁠גַנּ֔⁠וֹ לַ⁠עֲרוּג֖וֹת הַ⁠בֹּ֑שֶׂם לִ⁠רְעוֹת֙ בַּ⁠גַּנִּ֔ים וְ⁠לִ⁠לְקֹ֖ט שֽׁוֹשַׁנִּֽים</w:t>
       </w:r>
     </w:p>
     <w:p>
@@ -48496,22 +47264,6 @@
       </w:r>
       <w:r>
         <w:rPr>
-          <w:lang w:val="ar_AE" w:bidi="ar_AE"/>
-        </w:rPr>
-        <w:t>אֲנִ֤י לְ⁠דוֹדִ⁠י֙ וְ⁠דוֹדִ֣⁠י לִ֔⁠י</w:t>
-      </w:r>
-    </w:p>
-    <w:p>
-      <w:pPr>
-        <w:bidi/>
-      </w:pPr>
-      <w:r>
-        <w:rPr>
-          <w:lang w:val="ar_AE" w:bidi="ar_AE"/>
-        </w:rPr>
-      </w:r>
-      <w:r>
-        <w:rPr>
           <w:b/>
           <w:lang w:val="ar_AE" w:bidi="ar_AE"/>
         </w:rPr>
@@ -48626,22 +47378,6 @@
       </w:r>
       <w:r>
         <w:rPr>
-          <w:lang w:val="ar_AE" w:bidi="ar_AE"/>
-        </w:rPr>
-        <w:t>הָ⁠רֹעֶ֖ה בַּ⁠שׁוֹשַׁנִּֽים</w:t>
-      </w:r>
-    </w:p>
-    <w:p>
-      <w:pPr>
-        <w:bidi/>
-      </w:pPr>
-      <w:r>
-        <w:rPr>
-          <w:lang w:val="ar_AE" w:bidi="ar_AE"/>
-        </w:rPr>
-      </w:r>
-      <w:r>
-        <w:rPr>
           <w:b/>
           <w:lang w:val="ar_AE" w:bidi="ar_AE"/>
         </w:rPr>
@@ -49040,22 +47776,6 @@
       </w:r>
       <w:r>
         <w:rPr>
-          <w:lang w:val="ar_AE" w:bidi="ar_AE"/>
-        </w:rPr>
-        <w:t>יָפָ֨ה אַ֤תְּ רַעְיָתִ⁠י֙ כְּ⁠תִרְצָ֔ה</w:t>
-      </w:r>
-    </w:p>
-    <w:p>
-      <w:pPr>
-        <w:bidi/>
-      </w:pPr>
-      <w:r>
-        <w:rPr>
-          <w:lang w:val="ar_AE" w:bidi="ar_AE"/>
-        </w:rPr>
-      </w:r>
-      <w:r>
-        <w:rPr>
           <w:b/>
           <w:lang w:val="ar_AE" w:bidi="ar_AE"/>
         </w:rPr>
@@ -49149,22 +47869,6 @@
         <w:rPr>
           <w:lang w:val="ar_AE" w:bidi="ar_AE"/>
         </w:rPr>
-      </w:r>
-    </w:p>
-    <w:p>
-      <w:pPr>
-        <w:bidi/>
-      </w:pPr>
-      <w:r>
-        <w:rPr>
-          <w:lang w:val="ar_AE" w:bidi="ar_AE"/>
-        </w:rPr>
-      </w:r>
-      <w:r>
-        <w:rPr>
-          <w:lang w:val="ar_AE" w:bidi="ar_AE"/>
-        </w:rPr>
-        <w:t>נָאוָ֖ה כִּ⁠ירוּשָׁלִָ֑ם אֲיֻמָּ֖ה כַּ⁠נִּדְגָּלֽוֹת</w:t>
       </w:r>
     </w:p>
     <w:p>
@@ -49568,22 +48272,6 @@
       </w:r>
       <w:r>
         <w:rPr>
-          <w:lang w:val="ar_AE" w:bidi="ar_AE"/>
-        </w:rPr>
-        <w:t>שַׂעְרֵ⁠ךְ֙ כְּ⁠עֵ֣דֶר הָֽ⁠עִזִּ֔ים שֶׁ⁠גָּלְשׁ֖וּ מִן־הַ⁠גִּלְעָֽד</w:t>
-      </w:r>
-    </w:p>
-    <w:p>
-      <w:pPr>
-        <w:bidi/>
-      </w:pPr>
-      <w:r>
-        <w:rPr>
-          <w:lang w:val="ar_AE" w:bidi="ar_AE"/>
-        </w:rPr>
-      </w:r>
-      <w:r>
-        <w:rPr>
           <w:b/>
           <w:lang w:val="ar_AE" w:bidi="ar_AE"/>
         </w:rPr>
@@ -50712,22 +49400,6 @@
       </w:r>
       <w:r>
         <w:rPr>
-          <w:lang w:val="ar_AE" w:bidi="ar_AE"/>
-        </w:rPr>
-        <w:t>שִׁשִּׁ֥ים הֵ֨מָּה֙ מְּלָכ֔וֹת וּ⁠שְׁמֹנִ֖ים פִּֽילַגְשִׁ֑ים וַ⁠עֲלָמ֖וֹת אֵ֥ין מִסְפָּֽר׃ אַחַ֥ת הִיא֙ יוֹנָתִ֣⁠י תַמָּתִ֔⁠י אַחַ֥ת הִיא֙ לְ⁠אִמָּ֔⁠הּ בָּרָ֥ה הִ֖יא לְ⁠יֽוֹלַדְתָּ֑⁠הּ</w:t>
-      </w:r>
-    </w:p>
-    <w:p>
-      <w:pPr>
-        <w:bidi/>
-      </w:pPr>
-      <w:r>
-        <w:rPr>
-          <w:lang w:val="ar_AE" w:bidi="ar_AE"/>
-        </w:rPr>
-      </w:r>
-      <w:r>
-        <w:rPr>
           <w:b/>
           <w:lang w:val="ar_AE" w:bidi="ar_AE"/>
         </w:rPr>
@@ -51735,22 +50407,6 @@
       </w:r>
       <w:r>
         <w:rPr>
-          <w:lang w:val="ar_AE" w:bidi="ar_AE"/>
-        </w:rPr>
-        <w:t>מִי־זֹ֥את הַ⁠נִּשְׁקָפָ֖ה כְּמוֹ־שָׁ֑חַר יָפָ֣ה כַ⁠לְּבָנָ֗ה בָּרָה֙ כַּֽ⁠חַמָּ֔ה אֲיֻמָּ֖ה כַּ⁠נִּדְגָּלֽוֹת</w:t>
-      </w:r>
-    </w:p>
-    <w:p>
-      <w:pPr>
-        <w:bidi/>
-      </w:pPr>
-      <w:r>
-        <w:rPr>
-          <w:lang w:val="ar_AE" w:bidi="ar_AE"/>
-        </w:rPr>
-      </w:r>
-      <w:r>
-        <w:rPr>
           <w:b/>
           <w:lang w:val="ar_AE" w:bidi="ar_AE"/>
         </w:rPr>
@@ -51896,22 +50552,6 @@
       </w:r>
       <w:r>
         <w:rPr>
-          <w:lang w:val="ar_AE" w:bidi="ar_AE"/>
-        </w:rPr>
-        <w:t>מִי־זֹ֥את הַ⁠נִּשְׁקָפָ֖ה כְּמוֹ־שָׁ֑חַר יָפָ֣ה כַ⁠לְּבָנָ֗ה בָּרָה֙ כַּֽ⁠חַמָּ֔ה אֲיֻמָּ֖ה כַּ⁠נִּדְגָּלֽוֹת</w:t>
-      </w:r>
-    </w:p>
-    <w:p>
-      <w:pPr>
-        <w:bidi/>
-      </w:pPr>
-      <w:r>
-        <w:rPr>
-          <w:lang w:val="ar_AE" w:bidi="ar_AE"/>
-        </w:rPr>
-      </w:r>
-      <w:r>
-        <w:rPr>
           <w:b/>
           <w:lang w:val="ar_AE" w:bidi="ar_AE"/>
         </w:rPr>
@@ -52126,22 +50766,6 @@
       </w:r>
       <w:r>
         <w:rPr>
-          <w:lang w:val="ar_AE" w:bidi="ar_AE"/>
-        </w:rPr>
-        <w:t>הַ⁠נִּשְׁקָפָ֖ה כְּמוֹ־שָׁ֑חַר יָפָ֣ה כַ⁠לְּבָנָ֗ה בָּרָה֙ כַּֽ⁠חַמָּ֔ה</w:t>
-      </w:r>
-    </w:p>
-    <w:p>
-      <w:pPr>
-        <w:bidi/>
-      </w:pPr>
-      <w:r>
-        <w:rPr>
-          <w:lang w:val="ar_AE" w:bidi="ar_AE"/>
-        </w:rPr>
-      </w:r>
-      <w:r>
-        <w:rPr>
           <w:b/>
           <w:lang w:val="ar_AE" w:bidi="ar_AE"/>
         </w:rPr>
@@ -52247,22 +50871,6 @@
         <w:rPr>
           <w:lang w:val="ar_AE" w:bidi="ar_AE"/>
         </w:rPr>
-      </w:r>
-    </w:p>
-    <w:p>
-      <w:pPr>
-        <w:bidi/>
-      </w:pPr>
-      <w:r>
-        <w:rPr>
-          <w:lang w:val="ar_AE" w:bidi="ar_AE"/>
-        </w:rPr>
-      </w:r>
-      <w:r>
-        <w:rPr>
-          <w:lang w:val="ar_AE" w:bidi="ar_AE"/>
-        </w:rPr>
-        <w:t>אֲיֻמָּ֖ה כַּ⁠נִּדְגָּלֽוֹת</w:t>
       </w:r>
     </w:p>
     <w:p>
@@ -52549,22 +51157,6 @@
       </w:r>
       <w:r>
         <w:rPr>
-          <w:lang w:val="ar_AE" w:bidi="ar_AE"/>
-        </w:rPr>
-        <w:t>אֶל־גִּנַּ֤ת אֱגוֹז֙ יָרַ֔דְתִּי</w:t>
-      </w:r>
-    </w:p>
-    <w:p>
-      <w:pPr>
-        <w:bidi/>
-      </w:pPr>
-      <w:r>
-        <w:rPr>
-          <w:lang w:val="ar_AE" w:bidi="ar_AE"/>
-        </w:rPr>
-      </w:r>
-      <w:r>
-        <w:rPr>
           <w:b/>
           <w:lang w:val="ar_AE" w:bidi="ar_AE"/>
         </w:rPr>
@@ -54266,22 +52858,6 @@
       </w:r>
       <w:r>
         <w:rPr>
-          <w:lang w:val="ar_AE" w:bidi="ar_AE"/>
-        </w:rPr>
-        <w:t>מַה־יָּפ֧וּ פְעָמַ֛יִ⁠ךְ בַּ⁠נְּעָלִ֖ים בַּת־נָדִ֑יב חַמּוּקֵ֣י יְרֵכַ֔יִ⁠ךְ כְּמ֣וֹ חֲלָאִ֔ים מַעֲשֵׂ֖ה יְדֵ֥י אָמָּֽן</w:t>
-      </w:r>
-    </w:p>
-    <w:p>
-      <w:pPr>
-        <w:bidi/>
-      </w:pPr>
-      <w:r>
-        <w:rPr>
-          <w:lang w:val="ar_AE" w:bidi="ar_AE"/>
-        </w:rPr>
-      </w:r>
-      <w:r>
-        <w:rPr>
           <w:b/>
           <w:lang w:val="ar_AE" w:bidi="ar_AE"/>
         </w:rPr>
@@ -54572,22 +53148,6 @@
       </w:r>
       <w:r>
         <w:rPr>
-          <w:lang w:val="ar_AE" w:bidi="ar_AE"/>
-        </w:rPr>
-        <w:t>מַה־יָּפ֧וּ פְעָמַ֛יִ⁠ךְ בַּ⁠נְּעָלִ֖ים בַּת־נָדִ֑יב</w:t>
-      </w:r>
-    </w:p>
-    <w:p>
-      <w:pPr>
-        <w:bidi/>
-      </w:pPr>
-      <w:r>
-        <w:rPr>
-          <w:lang w:val="ar_AE" w:bidi="ar_AE"/>
-        </w:rPr>
-      </w:r>
-      <w:r>
-        <w:rPr>
           <w:b/>
           <w:lang w:val="ar_AE" w:bidi="ar_AE"/>
         </w:rPr>
@@ -56025,22 +54585,6 @@
         <w:rPr>
           <w:lang w:val="ar_AE" w:bidi="ar_AE"/>
         </w:rPr>
-      </w:r>
-    </w:p>
-    <w:p>
-      <w:pPr>
-        <w:bidi/>
-      </w:pPr>
-      <w:r>
-        <w:rPr>
-          <w:lang w:val="ar_AE" w:bidi="ar_AE"/>
-        </w:rPr>
-      </w:r>
-      <w:r>
-        <w:rPr>
-          <w:lang w:val="ar_AE" w:bidi="ar_AE"/>
-        </w:rPr>
-        <w:t>סוּגָ֖ה בַּ⁠שּׁוֹשַׁנִּֽים</w:t>
       </w:r>
     </w:p>
     <w:p>
@@ -56420,6 +54964,22 @@
       </w:r>
       <w:r>
         <w:rPr>
+          <w:lang w:val="ar_AE" w:bidi="ar_AE"/>
+        </w:rPr>
+        <w:t>הַ⁠שֵּׁ֑ן</w:t>
+      </w:r>
+    </w:p>
+    <w:p>
+      <w:pPr>
+        <w:bidi/>
+      </w:pPr>
+      <w:r>
+        <w:rPr>
+          <w:lang w:val="ar_AE" w:bidi="ar_AE"/>
+        </w:rPr>
+      </w:r>
+      <w:r>
+        <w:rPr>
           <w:b/>
           <w:lang w:val="ar_AE" w:bidi="ar_AE"/>
         </w:rPr>
@@ -56824,22 +55384,6 @@
       </w:r>
       <w:r>
         <w:rPr>
-          <w:lang w:val="ar_AE" w:bidi="ar_AE"/>
-        </w:rPr>
-        <w:t>עַל־שַׁ֨עַר֙ בַּת־רַבִּ֔ים</w:t>
-      </w:r>
-    </w:p>
-    <w:p>
-      <w:pPr>
-        <w:bidi/>
-      </w:pPr>
-      <w:r>
-        <w:rPr>
-          <w:lang w:val="ar_AE" w:bidi="ar_AE"/>
-        </w:rPr>
-      </w:r>
-      <w:r>
-        <w:rPr>
           <w:b/>
           <w:lang w:val="ar_AE" w:bidi="ar_AE"/>
         </w:rPr>
@@ -59464,22 +58008,6 @@
       </w:r>
       <w:r>
         <w:rPr>
-          <w:lang w:val="ar_AE" w:bidi="ar_AE"/>
-        </w:rPr>
-        <w:t>אֶעֱלֶ֣ה בְ⁠תָמָ֔ר אֹֽחֲזָ֖ה בְּ⁠סַנְסִנָּ֑י⁠ו</w:t>
-      </w:r>
-    </w:p>
-    <w:p>
-      <w:pPr>
-        <w:bidi/>
-      </w:pPr>
-      <w:r>
-        <w:rPr>
-          <w:lang w:val="ar_AE" w:bidi="ar_AE"/>
-        </w:rPr>
-      </w:r>
-      <w:r>
-        <w:rPr>
           <w:b/>
           <w:lang w:val="ar_AE" w:bidi="ar_AE"/>
         </w:rPr>
@@ -61052,22 +59580,6 @@
       </w:r>
       <w:r>
         <w:rPr>
-          <w:lang w:val="ar_AE" w:bidi="ar_AE"/>
-        </w:rPr>
-        <w:t>הוֹלֵ֥ךְ לְ⁠דוֹדִ֖⁠י לְ⁠מֵישָׁרִ֑ים דּוֹבֵ֖ב שִׂפְתֵ֥י יְשֵׁנִֽים</w:t>
-      </w:r>
-    </w:p>
-    <w:p>
-      <w:pPr>
-        <w:bidi/>
-      </w:pPr>
-      <w:r>
-        <w:rPr>
-          <w:lang w:val="ar_AE" w:bidi="ar_AE"/>
-        </w:rPr>
-      </w:r>
-      <w:r>
-        <w:rPr>
           <w:b/>
           <w:lang w:val="ar_AE" w:bidi="ar_AE"/>
         </w:rPr>
@@ -61339,22 +59851,6 @@
         <w:rPr>
           <w:lang w:val="ar_AE" w:bidi="ar_AE"/>
         </w:rPr>
-      </w:r>
-    </w:p>
-    <w:p>
-      <w:pPr>
-        <w:bidi/>
-      </w:pPr>
-      <w:r>
-        <w:rPr>
-          <w:lang w:val="ar_AE" w:bidi="ar_AE"/>
-        </w:rPr>
-      </w:r>
-      <w:r>
-        <w:rPr>
-          <w:lang w:val="ar_AE" w:bidi="ar_AE"/>
-        </w:rPr>
-        <w:t>שִׂפְתֵ֥י יְשֵׁנִֽים</w:t>
       </w:r>
     </w:p>
     <w:p>
@@ -61802,22 +60298,6 @@
       </w:r>
       <w:r>
         <w:rPr>
-          <w:lang w:val="ar_AE" w:bidi="ar_AE"/>
-        </w:rPr>
-        <w:t>נָלִ֖ינָה בַּ⁠כְּפָרִֽים</w:t>
-      </w:r>
-    </w:p>
-    <w:p>
-      <w:pPr>
-        <w:bidi/>
-      </w:pPr>
-      <w:r>
-        <w:rPr>
-          <w:lang w:val="ar_AE" w:bidi="ar_AE"/>
-        </w:rPr>
-      </w:r>
-      <w:r>
-        <w:rPr>
           <w:b/>
           <w:lang w:val="ar_AE" w:bidi="ar_AE"/>
         </w:rPr>
@@ -62080,22 +60560,6 @@
       </w:r>
       <w:r>
         <w:rPr>
-          <w:lang w:val="ar_AE" w:bidi="ar_AE"/>
-        </w:rPr>
-        <w:t>נַשְׁכִּ֨ימָה֙</w:t>
-      </w:r>
-    </w:p>
-    <w:p>
-      <w:pPr>
-        <w:bidi/>
-      </w:pPr>
-      <w:r>
-        <w:rPr>
-          <w:lang w:val="ar_AE" w:bidi="ar_AE"/>
-        </w:rPr>
-      </w:r>
-      <w:r>
-        <w:rPr>
           <w:b/>
           <w:lang w:val="ar_AE" w:bidi="ar_AE"/>
         </w:rPr>
@@ -62286,6 +60750,22 @@
         <w:rPr>
           <w:lang w:val="ar_AE" w:bidi="ar_AE"/>
         </w:rPr>
+      </w:r>
+    </w:p>
+    <w:p>
+      <w:pPr>
+        <w:bidi/>
+      </w:pPr>
+      <w:r>
+        <w:rPr>
+          <w:lang w:val="ar_AE" w:bidi="ar_AE"/>
+        </w:rPr>
+      </w:r>
+      <w:r>
+        <w:rPr>
+          <w:lang w:val="ar_AE" w:bidi="ar_AE"/>
+        </w:rPr>
+        <w:t>הֵנֵ֖צוּ הָ⁠רִמּוֹנִ֑ים</w:t>
       </w:r>
     </w:p>
     <w:p>
@@ -62413,22 +60893,6 @@
       </w:r>
       <w:r>
         <w:rPr>
-          <w:lang w:val="ar_AE" w:bidi="ar_AE"/>
-        </w:rPr>
-        <w:t>פָּֽרְחָ֤ה הַ⁠גֶּ֨פֶן֙</w:t>
-      </w:r>
-    </w:p>
-    <w:p>
-      <w:pPr>
-        <w:bidi/>
-      </w:pPr>
-      <w:r>
-        <w:rPr>
-          <w:lang w:val="ar_AE" w:bidi="ar_AE"/>
-        </w:rPr>
-      </w:r>
-      <w:r>
-        <w:rPr>
           <w:b/>
           <w:lang w:val="ar_AE" w:bidi="ar_AE"/>
         </w:rPr>
@@ -62939,22 +61403,6 @@
       </w:r>
       <w:r>
         <w:rPr>
-          <w:lang w:val="ar_AE" w:bidi="ar_AE"/>
-        </w:rPr>
-        <w:t>וְ⁠עַל־פְּתָחֵ֨י⁠נוּ֙ כָּל־מְגָדִ֔ים</w:t>
-      </w:r>
-    </w:p>
-    <w:p>
-      <w:pPr>
-        <w:bidi/>
-      </w:pPr>
-      <w:r>
-        <w:rPr>
-          <w:lang w:val="ar_AE" w:bidi="ar_AE"/>
-        </w:rPr>
-      </w:r>
-      <w:r>
-        <w:rPr>
           <w:b/>
           <w:lang w:val="ar_AE" w:bidi="ar_AE"/>
         </w:rPr>
@@ -63131,22 +61579,6 @@
         <w:rPr>
           <w:lang w:val="ar_AE" w:bidi="ar_AE"/>
         </w:rPr>
-      </w:r>
-    </w:p>
-    <w:p>
-      <w:pPr>
-        <w:bidi/>
-      </w:pPr>
-      <w:r>
-        <w:rPr>
-          <w:lang w:val="ar_AE" w:bidi="ar_AE"/>
-        </w:rPr>
-      </w:r>
-      <w:r>
-        <w:rPr>
-          <w:lang w:val="ar_AE" w:bidi="ar_AE"/>
-        </w:rPr>
-        <w:t>דּוֹדִ֖⁠י צָפַ֥נְתִּי לָֽ⁠ךְ</w:t>
       </w:r>
     </w:p>
     <w:p>
@@ -63707,22 +62139,6 @@
       </w:r>
       <w:r>
         <w:rPr>
-          <w:lang w:val="ar_AE" w:bidi="ar_AE"/>
-        </w:rPr>
-        <w:t>מִ֤י יִתֶּנְ⁠ךָ֙ כְּ⁠אָ֣ח לִ֔⁠י יוֹנֵ֖ק שְׁדֵ֣י אִמִּ֑⁠י</w:t>
-      </w:r>
-    </w:p>
-    <w:p>
-      <w:pPr>
-        <w:bidi/>
-      </w:pPr>
-      <w:r>
-        <w:rPr>
-          <w:lang w:val="ar_AE" w:bidi="ar_AE"/>
-        </w:rPr>
-      </w:r>
-      <w:r>
-        <w:rPr>
           <w:b/>
           <w:lang w:val="ar_AE" w:bidi="ar_AE"/>
         </w:rPr>
@@ -64124,22 +62540,6 @@
       </w:r>
       <w:r>
         <w:rPr>
-          <w:lang w:val="ar_AE" w:bidi="ar_AE"/>
-        </w:rPr>
-        <w:t>אֶֽמְצָאֲ⁠ךָ֤ בַ⁠חוּץ֙ אֶשָׁ֣קְ⁠ךָ֔ גַּ֖ם לֹא־יָב֥וּזוּ לִֽ⁠י׃ אֶנְהָֽגֲ⁠ךָ֗ אֲבִֽיאֲ⁠ךָ֛ אֶל־בֵּ֥ית אִמִּ֖⁠י תְּלַמְּדֵ֑⁠נִי אַשְׁקְ⁠ךָ֙ מִ⁠יַּ֣יִן הָ⁠רֶ֔קַח מֵ⁠עֲסִ֖יס רִמֹּנִֽ⁠י</w:t>
-      </w:r>
-    </w:p>
-    <w:p>
-      <w:pPr>
-        <w:bidi/>
-      </w:pPr>
-      <w:r>
-        <w:rPr>
-          <w:lang w:val="ar_AE" w:bidi="ar_AE"/>
-        </w:rPr>
-      </w:r>
-      <w:r>
-        <w:rPr>
           <w:b/>
           <w:lang w:val="ar_AE" w:bidi="ar_AE"/>
         </w:rPr>
@@ -64259,22 +62659,6 @@
         <w:rPr>
           <w:lang w:val="ar_AE" w:bidi="ar_AE"/>
         </w:rPr>
-      </w:r>
-    </w:p>
-    <w:p>
-      <w:pPr>
-        <w:bidi/>
-      </w:pPr>
-      <w:r>
-        <w:rPr>
-          <w:lang w:val="ar_AE" w:bidi="ar_AE"/>
-        </w:rPr>
-      </w:r>
-      <w:r>
-        <w:rPr>
-          <w:lang w:val="ar_AE" w:bidi="ar_AE"/>
-        </w:rPr>
-        <w:t>אֲבִֽיאֲ⁠ךָ֛ אֶל־בֵּ֥ית אִמִּ֖⁠י</w:t>
       </w:r>
     </w:p>
     <w:p>
@@ -64431,22 +62815,6 @@
       </w:r>
       <w:r>
         <w:rPr>
-          <w:lang w:val="ar_AE" w:bidi="ar_AE"/>
-        </w:rPr>
-        <w:t>אֲבִֽיאֲ⁠ךָ֛ אֶל־בֵּ֥ית אִמִּ֖⁠י תְּלַמְּדֵ֑⁠נִי</w:t>
-      </w:r>
-    </w:p>
-    <w:p>
-      <w:pPr>
-        <w:bidi/>
-      </w:pPr>
-      <w:r>
-        <w:rPr>
-          <w:lang w:val="ar_AE" w:bidi="ar_AE"/>
-        </w:rPr>
-      </w:r>
-      <w:r>
-        <w:rPr>
           <w:b/>
           <w:lang w:val="ar_AE" w:bidi="ar_AE"/>
         </w:rPr>
@@ -65374,22 +63742,6 @@
       </w:r>
       <w:r>
         <w:rPr>
-          <w:lang w:val="ar_AE" w:bidi="ar_AE"/>
-        </w:rPr>
-        <w:t>מִ֣י זֹ֗את עֹלָה֙ מִן־הַ⁠מִּדְבָּ֔ר מִתְרַפֶּ֖קֶת עַל־דּוֹדָ֑⁠הּ</w:t>
-      </w:r>
-    </w:p>
-    <w:p>
-      <w:pPr>
-        <w:bidi/>
-      </w:pPr>
-      <w:r>
-        <w:rPr>
-          <w:lang w:val="ar_AE" w:bidi="ar_AE"/>
-        </w:rPr>
-      </w:r>
-      <w:r>
-        <w:rPr>
           <w:b/>
           <w:lang w:val="ar_AE" w:bidi="ar_AE"/>
         </w:rPr>
@@ -66118,22 +64470,6 @@
       </w:r>
       <w:r>
         <w:rPr>
-          <w:lang w:val="ar_AE" w:bidi="ar_AE"/>
-        </w:rPr>
-        <w:t>תַּ֤חַת הַ⁠תַּפּ֨וּחַ֙ עֽוֹרַרְתִּ֔י⁠ךָ שָׁ֚מָּ⁠ה חִבְּלַ֣תְ⁠ךָ אִמֶּ֔⁠ךָ שָׁ֖מָּ⁠ה חִבְּלָ֥ה יְלָדַֽתְ⁠ךָ׃ שִׂימֵ֨⁠נִי כַֽ⁠חוֹתָ֜ם עַל־לִבֶּ֗⁠ךָ כַּֽ⁠חוֹתָם֙ עַל־זְרוֹעֶ֔⁠ךָ כִּֽי־עַזָּ֤ה כַ⁠מָּ֨וֶת֙ אַהֲבָ֔ה קָשָׁ֥ה כִ⁠שְׁא֖וֹל קִנְאָ֑ה רְשָׁפֶ֕י⁠הָ רִשְׁפֵּ֕י אֵ֖שׁ שַׁלְהֶ֥בֶתְ יָֽה׃ מַ֣יִם רַבִּ֗ים לֹ֤א יֽוּכְלוּ֙ לְ⁠כַבּ֣וֹת אֶת־הָֽ⁠אַהֲבָ֔ה וּ⁠נְהָר֖וֹת לֹ֣א יִשְׁטְפ֑וּ⁠הָ אִם־יִתֵּ֨ן אִ֜ישׁ אֶת־כָּל־ה֤וֹן בֵּית⁠וֹ֙ בָּ⁠אַהֲבָ֔ה בּ֖וֹז יָב֥וּזוּ לֽ⁠וֹ</w:t>
-      </w:r>
-    </w:p>
-    <w:p>
-      <w:pPr>
-        <w:bidi/>
-      </w:pPr>
-      <w:r>
-        <w:rPr>
-          <w:lang w:val="ar_AE" w:bidi="ar_AE"/>
-        </w:rPr>
-      </w:r>
-      <w:r>
-        <w:rPr>
           <w:b/>
           <w:lang w:val="ar_AE" w:bidi="ar_AE"/>
         </w:rPr>
@@ -67884,22 +66220,6 @@
       </w:r>
       <w:r>
         <w:rPr>
-          <w:lang w:val="ar_AE" w:bidi="ar_AE"/>
-        </w:rPr>
-        <w:t>מַ֣יִם רַבִּ֗ים לֹ֤א יֽוּכְלוּ֙ לְ⁠כַבּ֣וֹת אֶת־הָֽ⁠אַהֲבָ֔ה וּ⁠נְהָר֖וֹת לֹ֣א יִשְׁטְפ֑וּ⁠הָ</w:t>
-      </w:r>
-    </w:p>
-    <w:p>
-      <w:pPr>
-        <w:bidi/>
-      </w:pPr>
-      <w:r>
-        <w:rPr>
-          <w:lang w:val="ar_AE" w:bidi="ar_AE"/>
-        </w:rPr>
-      </w:r>
-      <w:r>
-        <w:rPr>
           <w:b/>
           <w:lang w:val="ar_AE" w:bidi="ar_AE"/>
         </w:rPr>
@@ -68089,22 +66409,6 @@
       </w:r>
       <w:r>
         <w:rPr>
-          <w:lang w:val="ar_AE" w:bidi="ar_AE"/>
-        </w:rPr>
-        <w:t>אִם־יִתֵּ֨ן אִ֜ישׁ אֶת־כָּל־ה֤וֹן בֵּית⁠וֹ֙ בָּ⁠אַהֲבָ֔ה בּ֖וֹז יָב֥וּזוּ לֽ⁠וֹ</w:t>
-      </w:r>
-    </w:p>
-    <w:p>
-      <w:pPr>
-        <w:bidi/>
-      </w:pPr>
-      <w:r>
-        <w:rPr>
-          <w:lang w:val="ar_AE" w:bidi="ar_AE"/>
-        </w:rPr>
-      </w:r>
-      <w:r>
-        <w:rPr>
           <w:b/>
           <w:lang w:val="ar_AE" w:bidi="ar_AE"/>
         </w:rPr>
@@ -68211,22 +66515,6 @@
       </w:r>
       <w:r>
         <w:rPr>
-          <w:lang w:val="ar_AE" w:bidi="ar_AE"/>
-        </w:rPr>
-        <w:t>בָּ⁠אַהֲבָ֔ה</w:t>
-      </w:r>
-    </w:p>
-    <w:p>
-      <w:pPr>
-        <w:bidi/>
-      </w:pPr>
-      <w:r>
-        <w:rPr>
-          <w:lang w:val="ar_AE" w:bidi="ar_AE"/>
-        </w:rPr>
-      </w:r>
-      <w:r>
-        <w:rPr>
           <w:b/>
           <w:lang w:val="ar_AE" w:bidi="ar_AE"/>
         </w:rPr>
@@ -69255,154 +67543,154 @@
       </w:r>
       <w:r>
         <w:rPr>
+          <w:b/>
+          <w:lang w:val="ar_AE" w:bidi="ar_AE"/>
+        </w:rPr>
+        <w:t>"</w:t>
+      </w:r>
+      <w:r>
+        <w:rPr>
+          <w:b/>
+          <w:lang w:val="ar_AE" w:bidi="ar_AE"/>
+        </w:rPr>
+        <w:t>إنْ تكُنْ سورًا</w:t>
+      </w:r>
+      <w:r>
+        <w:rPr>
+          <w:b/>
+          <w:lang w:val="ar_AE" w:bidi="ar_AE"/>
+        </w:rPr>
+        <w:t>"</w:t>
+      </w:r>
+    </w:p>
+    <w:p>
+      <w:pPr>
+        <w:bidi/>
+      </w:pPr>
+      <w:r>
+        <w:rPr>
+          <w:lang w:val="ar_AE" w:bidi="ar_AE"/>
+        </w:rPr>
+      </w:r>
+      <w:r>
+        <w:rPr>
+          <w:lang w:val="ar_AE" w:bidi="ar_AE"/>
+        </w:rPr>
+        <w:t>يتحدث إخوة المرأة عنها وكأنها "</w:t>
+      </w:r>
+      <w:r>
+        <w:rPr>
+          <w:b/>
+          <w:lang w:val="ar_AE" w:bidi="ar_AE"/>
+        </w:rPr>
+        <w:t>سورًا</w:t>
+      </w:r>
+      <w:r>
+        <w:rPr>
+          <w:lang w:val="ar_AE" w:bidi="ar_AE"/>
+        </w:rPr>
+        <w:t>" ينوون أن يبنوا عليه "</w:t>
+      </w:r>
+      <w:r>
+        <w:rPr>
+          <w:b/>
+          <w:lang w:val="ar_AE" w:bidi="ar_AE"/>
+        </w:rPr>
+        <w:t>بُرجَ فِضَّةٍ</w:t>
+      </w:r>
+      <w:r>
+        <w:rPr>
+          <w:lang w:val="ar_AE" w:bidi="ar_AE"/>
+        </w:rPr>
+        <w:t xml:space="preserve">". وقد يكون المقصود من هذا التشبيه أحد المعنيين التاليين: (1) أنهم سيجتهدون في حماية عفتها، كما يُحمى </w:t>
+      </w:r>
+      <w:r>
+        <w:rPr>
+          <w:b/>
+          <w:lang w:val="ar_AE" w:bidi="ar_AE"/>
+        </w:rPr>
+        <w:t xml:space="preserve">السور </w:t>
+      </w:r>
+      <w:r>
+        <w:rPr>
+          <w:lang w:val="ar_AE" w:bidi="ar_AE"/>
+        </w:rPr>
+        <w:t>ببناء برجٍ فضيٍّ عليه (والبرج هو عمود من الحجارة يُبنى على السور لأجل حمايته). ترجمة بديلة: "سنحفظ عفتها كما نُحصّن سورًا ببناء برج فضّيّ فوقه". (2) أو أن صدرها مسطّح كسور لأن ثدييها لم يكتمل نموهما بعد، فيرغبون في تزيينها لتبدو أجمل أمام من ستتزوجه، بوضع حُليّ فضيّة كأنها أبراج. ترجمة بديلة: "وإن كان صدرها مُسطّح كالسور، نُزيّنه بحُليّ من فضة تُشبه الأبراج".</w:t>
+      </w:r>
+    </w:p>
+    <w:p>
+      <w:pPr>
+        <w:bidi/>
+      </w:pPr>
+      <w:r>
+        <w:rPr>
+          <w:lang w:val="ar_AE" w:bidi="ar_AE"/>
+        </w:rPr>
+      </w:r>
+      <w:r>
+        <w:rPr>
+          <w:lang w:val="ar_AE" w:bidi="ar_AE"/>
+        </w:rPr>
+        <w:t xml:space="preserve">انظر: </w:t>
+      </w:r>
+      <w:r>
+        <w:rPr>
+          <w:lang w:val="ar_AE" w:bidi="ar_AE"/>
+        </w:rPr>
+        <w:t>الاستعارة</w:t>
+      </w:r>
+      <w:r>
+        <w:rPr>
+          <w:lang w:val="ar_AE" w:bidi="ar_AE"/>
+        </w:rPr>
+      </w:r>
+      <w:r>
+        <w:rPr>
+          <w:lang w:val="ar_AE" w:bidi="ar_AE"/>
+        </w:rPr>
+      </w:r>
+    </w:p>
+    <w:p>
+      <w:pPr>
+        <w:bidi/>
+      </w:pPr>
+      <w:r>
+        <w:rPr>
+          <w:lang w:val="ar_AE" w:bidi="ar_AE"/>
+        </w:rPr>
+      </w:r>
+    </w:p>
+    <w:p>
+      <w:pPr>
+        <w:pStyle w:val="Heading2"/>
+        <w:bidi/>
+      </w:pPr>
+      <w:r>
+        <w:rPr>
+          <w:lang w:val="ar_AE" w:bidi="ar_AE"/>
+        </w:rPr>
+        <w:t>نشيد الأنشاد 8: 9 (#2)</w:t>
+      </w:r>
+      <w:r>
+        <w:rPr>
+          <w:lang w:val="ar_AE" w:bidi="ar_AE"/>
+        </w:rPr>
+      </w:r>
+    </w:p>
+    <w:p>
+      <w:pPr>
+        <w:bidi/>
+      </w:pPr>
+      <w:r>
+        <w:rPr>
+          <w:lang w:val="ar_AE" w:bidi="ar_AE"/>
+        </w:rPr>
+      </w:r>
+      <w:r>
+        <w:rPr>
           <w:lang w:val="ar_AE" w:bidi="ar_AE"/>
         </w:rPr>
         <w:t>וְ⁠אִם־דֶּ֣לֶת הִ֔יא נָצ֥וּר עָלֶ֖י⁠הָ ל֥וּחַ אָֽרֶז</w:t>
-      </w:r>
-    </w:p>
-    <w:p>
-      <w:pPr>
-        <w:bidi/>
-      </w:pPr>
-      <w:r>
-        <w:rPr>
-          <w:lang w:val="ar_AE" w:bidi="ar_AE"/>
-        </w:rPr>
-      </w:r>
-      <w:r>
-        <w:rPr>
-          <w:b/>
-          <w:lang w:val="ar_AE" w:bidi="ar_AE"/>
-        </w:rPr>
-        <w:t>"</w:t>
-      </w:r>
-      <w:r>
-        <w:rPr>
-          <w:b/>
-          <w:lang w:val="ar_AE" w:bidi="ar_AE"/>
-        </w:rPr>
-        <w:t>إنْ تكُنْ سورًا</w:t>
-      </w:r>
-      <w:r>
-        <w:rPr>
-          <w:b/>
-          <w:lang w:val="ar_AE" w:bidi="ar_AE"/>
-        </w:rPr>
-        <w:t>"</w:t>
-      </w:r>
-    </w:p>
-    <w:p>
-      <w:pPr>
-        <w:bidi/>
-      </w:pPr>
-      <w:r>
-        <w:rPr>
-          <w:lang w:val="ar_AE" w:bidi="ar_AE"/>
-        </w:rPr>
-      </w:r>
-      <w:r>
-        <w:rPr>
-          <w:lang w:val="ar_AE" w:bidi="ar_AE"/>
-        </w:rPr>
-        <w:t>يتحدث إخوة المرأة عنها وكأنها "</w:t>
-      </w:r>
-      <w:r>
-        <w:rPr>
-          <w:b/>
-          <w:lang w:val="ar_AE" w:bidi="ar_AE"/>
-        </w:rPr>
-        <w:t>سورًا</w:t>
-      </w:r>
-      <w:r>
-        <w:rPr>
-          <w:lang w:val="ar_AE" w:bidi="ar_AE"/>
-        </w:rPr>
-        <w:t>" ينوون أن يبنوا عليه "</w:t>
-      </w:r>
-      <w:r>
-        <w:rPr>
-          <w:b/>
-          <w:lang w:val="ar_AE" w:bidi="ar_AE"/>
-        </w:rPr>
-        <w:t>بُرجَ فِضَّةٍ</w:t>
-      </w:r>
-      <w:r>
-        <w:rPr>
-          <w:lang w:val="ar_AE" w:bidi="ar_AE"/>
-        </w:rPr>
-        <w:t xml:space="preserve">". وقد يكون المقصود من هذا التشبيه أحد المعنيين التاليين: (1) أنهم سيجتهدون في حماية عفتها، كما يُحمى </w:t>
-      </w:r>
-      <w:r>
-        <w:rPr>
-          <w:b/>
-          <w:lang w:val="ar_AE" w:bidi="ar_AE"/>
-        </w:rPr>
-        <w:t xml:space="preserve">السور </w:t>
-      </w:r>
-      <w:r>
-        <w:rPr>
-          <w:lang w:val="ar_AE" w:bidi="ar_AE"/>
-        </w:rPr>
-        <w:t>ببناء برجٍ فضيٍّ عليه (والبرج هو عمود من الحجارة يُبنى على السور لأجل حمايته). ترجمة بديلة: "سنحفظ عفتها كما نُحصّن سورًا ببناء برج فضّيّ فوقه". (2) أو أن صدرها مسطّح كسور لأن ثدييها لم يكتمل نموهما بعد، فيرغبون في تزيينها لتبدو أجمل أمام من ستتزوجه، بوضع حُليّ فضيّة كأنها أبراج. ترجمة بديلة: "وإن كان صدرها مُسطّح كالسور، نُزيّنه بحُليّ من فضة تُشبه الأبراج".</w:t>
-      </w:r>
-    </w:p>
-    <w:p>
-      <w:pPr>
-        <w:bidi/>
-      </w:pPr>
-      <w:r>
-        <w:rPr>
-          <w:lang w:val="ar_AE" w:bidi="ar_AE"/>
-        </w:rPr>
-      </w:r>
-      <w:r>
-        <w:rPr>
-          <w:lang w:val="ar_AE" w:bidi="ar_AE"/>
-        </w:rPr>
-        <w:t xml:space="preserve">انظر: </w:t>
-      </w:r>
-      <w:r>
-        <w:rPr>
-          <w:lang w:val="ar_AE" w:bidi="ar_AE"/>
-        </w:rPr>
-        <w:t>الاستعارة</w:t>
-      </w:r>
-      <w:r>
-        <w:rPr>
-          <w:lang w:val="ar_AE" w:bidi="ar_AE"/>
-        </w:rPr>
-      </w:r>
-      <w:r>
-        <w:rPr>
-          <w:lang w:val="ar_AE" w:bidi="ar_AE"/>
-        </w:rPr>
-      </w:r>
-    </w:p>
-    <w:p>
-      <w:pPr>
-        <w:bidi/>
-      </w:pPr>
-      <w:r>
-        <w:rPr>
-          <w:lang w:val="ar_AE" w:bidi="ar_AE"/>
-        </w:rPr>
-      </w:r>
-    </w:p>
-    <w:p>
-      <w:pPr>
-        <w:pStyle w:val="Heading2"/>
-        <w:bidi/>
-      </w:pPr>
-      <w:r>
-        <w:rPr>
-          <w:lang w:val="ar_AE" w:bidi="ar_AE"/>
-        </w:rPr>
-        <w:t>نشيد الأنشاد 8: 9 (#2)</w:t>
-      </w:r>
-      <w:r>
-        <w:rPr>
-          <w:lang w:val="ar_AE" w:bidi="ar_AE"/>
-        </w:rPr>
       </w:r>
     </w:p>
     <w:p>
@@ -69594,22 +67882,6 @@
       </w:r>
       <w:r>
         <w:rPr>
-          <w:lang w:val="ar_AE" w:bidi="ar_AE"/>
-        </w:rPr>
-        <w:t>אֲנִ֣י חוֹמָ֔ה וְ⁠שָׁדַ֖⁠י כַּ⁠מִּגְדָּל֑וֹת אָ֛ז הָיִ֥יתִי בְ⁠עֵינָ֖י⁠ו כְּ⁠מוֹצְאֵ֥ת שָׁלֽוֹם</w:t>
-      </w:r>
-    </w:p>
-    <w:p>
-      <w:pPr>
-        <w:bidi/>
-      </w:pPr>
-      <w:r>
-        <w:rPr>
-          <w:lang w:val="ar_AE" w:bidi="ar_AE"/>
-        </w:rPr>
-      </w:r>
-      <w:r>
-        <w:rPr>
           <w:b/>
           <w:lang w:val="ar_AE" w:bidi="ar_AE"/>
         </w:rPr>
@@ -69837,22 +68109,6 @@
       </w:r>
       <w:r>
         <w:rPr>
-          <w:lang w:val="ar_AE" w:bidi="ar_AE"/>
-        </w:rPr>
-        <w:t>וְ⁠שָׁדַ֖⁠י</w:t>
-      </w:r>
-    </w:p>
-    <w:p>
-      <w:pPr>
-        <w:bidi/>
-      </w:pPr>
-      <w:r>
-        <w:rPr>
-          <w:lang w:val="ar_AE" w:bidi="ar_AE"/>
-        </w:rPr>
-      </w:r>
-      <w:r>
-        <w:rPr>
           <w:b/>
           <w:lang w:val="ar_AE" w:bidi="ar_AE"/>
         </w:rPr>
@@ -70426,22 +68682,6 @@
       </w:r>
       <w:r>
         <w:rPr>
-          <w:lang w:val="ar_AE" w:bidi="ar_AE"/>
-        </w:rPr>
-        <w:t>הָיִ֥יתִי בְ⁠עֵינָ֖י⁠ו כְּ⁠מוֹצְאֵ֥ת שָׁלֽוֹם</w:t>
-      </w:r>
-    </w:p>
-    <w:p>
-      <w:pPr>
-        <w:bidi/>
-      </w:pPr>
-      <w:r>
-        <w:rPr>
-          <w:lang w:val="ar_AE" w:bidi="ar_AE"/>
-        </w:rPr>
-      </w:r>
-      <w:r>
-        <w:rPr>
           <w:b/>
           <w:lang w:val="ar_AE" w:bidi="ar_AE"/>
         </w:rPr>
@@ -70841,22 +69081,6 @@
       </w:r>
       <w:r>
         <w:rPr>
-          <w:lang w:val="ar_AE" w:bidi="ar_AE"/>
-        </w:rPr>
-        <w:t>נָתַ֥ן אֶת־הַ⁠כֶּ֖רֶם לַ⁠נֹּטְרִ֑ים</w:t>
-      </w:r>
-    </w:p>
-    <w:p>
-      <w:pPr>
-        <w:bidi/>
-      </w:pPr>
-      <w:r>
-        <w:rPr>
-          <w:lang w:val="ar_AE" w:bidi="ar_AE"/>
-        </w:rPr>
-      </w:r>
-      <w:r>
-        <w:rPr>
           <w:b/>
           <w:lang w:val="ar_AE" w:bidi="ar_AE"/>
         </w:rPr>
@@ -70941,22 +69165,6 @@
       </w:r>
       <w:r>
         <w:rPr>
-          <w:lang w:val="ar_AE" w:bidi="ar_AE"/>
-        </w:rPr>
-        <w:t>אִ֛ישׁ יָבִ֥א בְּ⁠פִרְי֖⁠וֹ אֶ֥לֶף כָּֽסֶף</w:t>
-      </w:r>
-    </w:p>
-    <w:p>
-      <w:pPr>
-        <w:bidi/>
-      </w:pPr>
-      <w:r>
-        <w:rPr>
-          <w:lang w:val="ar_AE" w:bidi="ar_AE"/>
-        </w:rPr>
-      </w:r>
-      <w:r>
-        <w:rPr>
           <w:b/>
           <w:lang w:val="ar_AE" w:bidi="ar_AE"/>
         </w:rPr>
@@ -71089,22 +69297,6 @@
       </w:r>
       <w:r>
         <w:rPr>
-          <w:lang w:val="ar_AE" w:bidi="ar_AE"/>
-        </w:rPr>
-        <w:t>אֶ֥לֶף כָּֽסֶף</w:t>
-      </w:r>
-    </w:p>
-    <w:p>
-      <w:pPr>
-        <w:bidi/>
-      </w:pPr>
-      <w:r>
-        <w:rPr>
-          <w:lang w:val="ar_AE" w:bidi="ar_AE"/>
-        </w:rPr>
-      </w:r>
-      <w:r>
-        <w:rPr>
           <w:b/>
           <w:lang w:val="ar_AE" w:bidi="ar_AE"/>
         </w:rPr>
@@ -71198,22 +69390,6 @@
         <w:rPr>
           <w:lang w:val="ar_AE" w:bidi="ar_AE"/>
         </w:rPr>
-      </w:r>
-    </w:p>
-    <w:p>
-      <w:pPr>
-        <w:bidi/>
-      </w:pPr>
-      <w:r>
-        <w:rPr>
-          <w:lang w:val="ar_AE" w:bidi="ar_AE"/>
-        </w:rPr>
-      </w:r>
-      <w:r>
-        <w:rPr>
-          <w:lang w:val="ar_AE" w:bidi="ar_AE"/>
-        </w:rPr>
-        <w:t>כֶּ֣רֶם הָיָ֤ה לִ⁠שְׁלֹמֹה֙ בְּ⁠בַ֣עַל הָמ֔וֹן נָתַ֥ן אֶת־הַ⁠כֶּ֖רֶם לַ⁠נֹּטְרִ֑ים אִ֛ישׁ יָבִ֥א בְּ⁠פִרְי֖⁠וֹ אֶ֥לֶף כָּֽסֶף׃ כָּרְמִ֥⁠י שֶׁ⁠לִּ֖⁠י לְ⁠פָנָ֑⁠י הָ⁠אֶ֤לֶף לְ⁠ךָ֙ שְׁלֹמֹ֔ה וּ⁠מָאתַ֖יִם לְ⁠נֹטְרִ֥ים אֶת־פִּרְיֽ⁠וֹ</w:t>
       </w:r>
     </w:p>
     <w:p>
@@ -71678,22 +69854,6 @@
       </w:r>
       <w:r>
         <w:rPr>
-          <w:lang w:val="ar_AE" w:bidi="ar_AE"/>
-        </w:rPr>
-        <w:t>הָ⁠אֶ֤לֶף לְ⁠ךָ֙ שְׁלֹמֹ֔ה וּ⁠מָאתַ֖יִם לְ⁠נֹטְרִ֥ים אֶת־פִּרְיֽ⁠וֹ</w:t>
-      </w:r>
-    </w:p>
-    <w:p>
-      <w:pPr>
-        <w:bidi/>
-      </w:pPr>
-      <w:r>
-        <w:rPr>
-          <w:lang w:val="ar_AE" w:bidi="ar_AE"/>
-        </w:rPr>
-      </w:r>
-      <w:r>
-        <w:rPr>
           <w:b/>
           <w:lang w:val="ar_AE" w:bidi="ar_AE"/>
         </w:rPr>
@@ -72030,22 +70190,6 @@
       </w:r>
       <w:r>
         <w:rPr>
-          <w:lang w:val="ar_AE" w:bidi="ar_AE"/>
-        </w:rPr>
-        <w:t>הַ⁠יוֹשֶׁ֣בֶת בַּ⁠גַּנִּ֗ים חֲבֵרִ֛ים מַקְשִׁיבִ֥ים לְ⁠קוֹלֵ֖⁠ךְ הַשְׁמִיעִֽי⁠נִי</w:t>
-      </w:r>
-    </w:p>
-    <w:p>
-      <w:pPr>
-        <w:bidi/>
-      </w:pPr>
-      <w:r>
-        <w:rPr>
-          <w:lang w:val="ar_AE" w:bidi="ar_AE"/>
-        </w:rPr>
-      </w:r>
-      <w:r>
-        <w:rPr>
           <w:b/>
           <w:lang w:val="ar_AE" w:bidi="ar_AE"/>
         </w:rPr>
@@ -72449,22 +70593,6 @@
       </w:r>
       <w:r>
         <w:rPr>
-          <w:lang w:val="ar_AE" w:bidi="ar_AE"/>
-        </w:rPr>
-        <w:t>בְּרַ֣ח ׀ דּוֹדִ֗⁠י וּֽ⁠דְמֵה־לְ⁠ךָ֤ לִ⁠צְבִי֙ א֚וֹ לְ⁠עֹ֣פֶר הָֽ⁠אַיָּלִ֔ים עַ֖ל הָרֵ֥י בְשָׂמִֽים</w:t>
-      </w:r>
-    </w:p>
-    <w:p>
-      <w:pPr>
-        <w:bidi/>
-      </w:pPr>
-      <w:r>
-        <w:rPr>
-          <w:lang w:val="ar_AE" w:bidi="ar_AE"/>
-        </w:rPr>
-      </w:r>
-      <w:r>
-        <w:rPr>
           <w:b/>
           <w:lang w:val="ar_AE" w:bidi="ar_AE"/>
         </w:rPr>
@@ -72693,22 +70821,6 @@
         <w:rPr>
           <w:lang w:val="ar_AE" w:bidi="ar_AE"/>
         </w:rPr>
-      </w:r>
-    </w:p>
-    <w:p>
-      <w:pPr>
-        <w:bidi/>
-      </w:pPr>
-      <w:r>
-        <w:rPr>
-          <w:lang w:val="ar_AE" w:bidi="ar_AE"/>
-        </w:rPr>
-      </w:r>
-      <w:r>
-        <w:rPr>
-          <w:lang w:val="ar_AE" w:bidi="ar_AE"/>
-        </w:rPr>
-        <w:t>דּוֹדִ֗⁠י וּֽ⁠דְמֵה־לְ⁠ךָ֤ לִ⁠צְבִי֙ א֚וֹ לְ⁠עֹ֣פֶר הָֽ⁠אַיָּלִ֔ים</w:t>
       </w:r>
     </w:p>
     <w:p>

</xml_diff>